<commit_message>
Adding TailwindCSS component notes
</commit_message>
<xml_diff>
--- a/Tailwindcss/Tailwindcss-notes-01.docx
+++ b/Tailwindcss/Tailwindcss-notes-01.docx
@@ -1155,7 +1155,6 @@
         </w:rPr>
         <w:t xml:space="preserve">color as a background, we use the pattern </w:t>
       </w:r>
-      <w:proofErr w:type="spellStart"/>
       <w:r>
         <w:rPr>
           <w:rFonts w:ascii="Sakkal Majalla" w:hAnsi="Sakkal Majalla" w:cs="Sakkal Majalla"/>
@@ -1165,19 +1164,7 @@
           <w:sz w:val="28"/>
           <w:szCs w:val="28"/>
         </w:rPr>
-        <w:t>bg</w:t>
-      </w:r>
-      <w:proofErr w:type="spellEnd"/>
-      <w:r>
-        <w:rPr>
-          <w:rFonts w:ascii="Sakkal Majalla" w:hAnsi="Sakkal Majalla" w:cs="Sakkal Majalla"/>
-          <w:b/>
-          <w:bCs/>
-          <w:color w:val="00B050"/>
-          <w:sz w:val="28"/>
-          <w:szCs w:val="28"/>
-        </w:rPr>
-        <w:t>-[color]-[number]</w:t>
+        <w:t>bg-[color]-[number]</w:t>
       </w:r>
       <w:r>
         <w:rPr>
@@ -1410,7 +1397,6 @@
         </w:rPr>
         <w:t xml:space="preserve">, we use the pattern </w:t>
       </w:r>
-      <w:proofErr w:type="spellStart"/>
       <w:r>
         <w:rPr>
           <w:rFonts w:ascii="Sakkal Majalla" w:hAnsi="Sakkal Majalla" w:cs="Sakkal Majalla"/>
@@ -1420,19 +1406,7 @@
           <w:sz w:val="28"/>
           <w:szCs w:val="28"/>
         </w:rPr>
-        <w:t>fas</w:t>
-      </w:r>
-      <w:proofErr w:type="spellEnd"/>
-      <w:r>
-        <w:rPr>
-          <w:rFonts w:ascii="Sakkal Majalla" w:hAnsi="Sakkal Majalla" w:cs="Sakkal Majalla"/>
-          <w:b/>
-          <w:bCs/>
-          <w:color w:val="EE0000"/>
-          <w:sz w:val="28"/>
-          <w:szCs w:val="28"/>
-        </w:rPr>
-        <w:t xml:space="preserve"> fa-[icon-name]</w:t>
+        <w:t>fas fa-[icon-name]</w:t>
       </w:r>
       <w:r>
         <w:rPr>
@@ -1442,7 +1416,6 @@
         </w:rPr>
         <w:t xml:space="preserve">. For example, to use a search icon for a search input, we can use the </w:t>
       </w:r>
-      <w:proofErr w:type="spellStart"/>
       <w:r>
         <w:rPr>
           <w:rFonts w:ascii="Sakkal Majalla" w:hAnsi="Sakkal Majalla" w:cs="Sakkal Majalla"/>
@@ -1452,9 +1425,134 @@
           <w:sz w:val="28"/>
           <w:szCs w:val="28"/>
         </w:rPr>
+        <w:t>fas fa-search classes</w:t>
+      </w:r>
+      <w:r>
+        <w:rPr>
+          <w:rFonts w:ascii="Sakkal Majalla" w:hAnsi="Sakkal Majalla" w:cs="Sakkal Majalla"/>
+          <w:sz w:val="28"/>
+          <w:szCs w:val="28"/>
+        </w:rPr>
+        <w:t>. Notice that</w:t>
+      </w:r>
+      <w:r>
+        <w:rPr>
+          <w:rFonts w:ascii="Sakkal Majalla" w:hAnsi="Sakkal Majalla" w:cs="Sakkal Majalla"/>
+          <w:sz w:val="28"/>
+          <w:szCs w:val="28"/>
+        </w:rPr>
+        <w:t xml:space="preserve"> </w:t>
+      </w:r>
+      <w:r>
+        <w:rPr>
+          <w:rFonts w:ascii="Sakkal Majalla" w:hAnsi="Sakkal Majalla" w:cs="Sakkal Majalla"/>
+          <w:b/>
+          <w:bCs/>
+          <w:color w:val="C45911" w:themeColor="accent2" w:themeShade="BF"/>
+          <w:sz w:val="28"/>
+          <w:szCs w:val="28"/>
+        </w:rPr>
         <w:t>fas</w:t>
       </w:r>
-      <w:proofErr w:type="spellEnd"/>
+      <w:r>
+        <w:rPr>
+          <w:rFonts w:ascii="Sakkal Majalla" w:hAnsi="Sakkal Majalla" w:cs="Sakkal Majalla"/>
+          <w:color w:val="C45911" w:themeColor="accent2" w:themeShade="BF"/>
+          <w:sz w:val="28"/>
+          <w:szCs w:val="28"/>
+        </w:rPr>
+        <w:t xml:space="preserve"> </w:t>
+      </w:r>
+      <w:r>
+        <w:rPr>
+          <w:rFonts w:ascii="Sakkal Majalla" w:hAnsi="Sakkal Majalla" w:cs="Sakkal Majalla"/>
+          <w:sz w:val="28"/>
+          <w:szCs w:val="28"/>
+        </w:rPr>
+        <w:t>placed before the icon name means that we use Font Awesome’s solid icons collectio</w:t>
+      </w:r>
+      <w:r>
+        <w:rPr>
+          <w:rFonts w:ascii="Sakkal Majalla" w:hAnsi="Sakkal Majalla" w:cs="Sakkal Majalla"/>
+          <w:sz w:val="28"/>
+          <w:szCs w:val="28"/>
+        </w:rPr>
+        <w:t>n</w:t>
+      </w:r>
+      <w:r>
+        <w:rPr>
+          <w:rFonts w:ascii="Sakkal Majalla" w:hAnsi="Sakkal Majalla" w:cs="Sakkal Majalla"/>
+          <w:sz w:val="28"/>
+          <w:szCs w:val="28"/>
+        </w:rPr>
+        <w:t xml:space="preserve">. Font Awesome offers some base styling for its icons, but we can style them with Tailwind’s utilities (for </w:t>
+      </w:r>
+      <w:r>
+        <w:rPr>
+          <w:rFonts w:ascii="Sakkal Majalla" w:hAnsi="Sakkal Majalla" w:cs="Sakkal Majalla"/>
+          <w:b/>
+          <w:bCs/>
+          <w:color w:val="C45911" w:themeColor="accent2" w:themeShade="BF"/>
+          <w:sz w:val="28"/>
+          <w:szCs w:val="28"/>
+        </w:rPr>
+        <w:t>color</w:t>
+      </w:r>
+      <w:r>
+        <w:rPr>
+          <w:rFonts w:ascii="Sakkal Majalla" w:hAnsi="Sakkal Majalla" w:cs="Sakkal Majalla"/>
+          <w:sz w:val="28"/>
+          <w:szCs w:val="28"/>
+        </w:rPr>
+        <w:t xml:space="preserve">, </w:t>
+      </w:r>
+      <w:r>
+        <w:rPr>
+          <w:rFonts w:ascii="Sakkal Majalla" w:hAnsi="Sakkal Majalla" w:cs="Sakkal Majalla"/>
+          <w:b/>
+          <w:bCs/>
+          <w:color w:val="C45911" w:themeColor="accent2" w:themeShade="BF"/>
+          <w:sz w:val="28"/>
+          <w:szCs w:val="28"/>
+        </w:rPr>
+        <w:t>size</w:t>
+      </w:r>
+      <w:r>
+        <w:rPr>
+          <w:rFonts w:ascii="Sakkal Majalla" w:hAnsi="Sakkal Majalla" w:cs="Sakkal Majalla"/>
+          <w:sz w:val="28"/>
+          <w:szCs w:val="28"/>
+        </w:rPr>
+        <w:t xml:space="preserve">, </w:t>
+      </w:r>
+      <w:r>
+        <w:rPr>
+          <w:rFonts w:ascii="Sakkal Majalla" w:hAnsi="Sakkal Majalla" w:cs="Sakkal Majalla"/>
+          <w:b/>
+          <w:bCs/>
+          <w:color w:val="C45911" w:themeColor="accent2" w:themeShade="BF"/>
+          <w:sz w:val="28"/>
+          <w:szCs w:val="28"/>
+        </w:rPr>
+        <w:t>etc</w:t>
+      </w:r>
+      <w:r>
+        <w:rPr>
+          <w:rFonts w:ascii="Sakkal Majalla" w:hAnsi="Sakkal Majalla" w:cs="Sakkal Majalla"/>
+          <w:sz w:val="28"/>
+          <w:szCs w:val="28"/>
+        </w:rPr>
+        <w:t>.) as well.</w:t>
+      </w:r>
+    </w:p>
+    <w:p>
+      <w:pPr>
+        <w:rPr>
+          <w:rFonts w:ascii="Sakkal Majalla" w:hAnsi="Sakkal Majalla" w:cs="Sakkal Majalla"/>
+          <w:sz w:val="28"/>
+          <w:szCs w:val="28"/>
+        </w:rPr>
+      </w:pPr>
       <w:r>
         <w:rPr>
           <w:rFonts w:ascii="Sakkal Majalla" w:hAnsi="Sakkal Majalla" w:cs="Sakkal Majalla"/>
@@ -1464,41 +1562,39 @@
           <w:sz w:val="28"/>
           <w:szCs w:val="28"/>
         </w:rPr>
-        <w:t xml:space="preserve"> fa-search classes</w:t>
-      </w:r>
-      <w:r>
-        <w:rPr>
-          <w:rFonts w:ascii="Sakkal Majalla" w:hAnsi="Sakkal Majalla" w:cs="Sakkal Majalla"/>
-          <w:sz w:val="28"/>
-          <w:szCs w:val="28"/>
-        </w:rPr>
-        <w:t>. Notice that</w:t>
-      </w:r>
-      <w:r>
-        <w:rPr>
-          <w:rFonts w:ascii="Sakkal Majalla" w:hAnsi="Sakkal Majalla" w:cs="Sakkal Majalla"/>
-          <w:sz w:val="28"/>
-          <w:szCs w:val="28"/>
-        </w:rPr>
-        <w:t xml:space="preserve"> </w:t>
-      </w:r>
-      <w:proofErr w:type="spellStart"/>
+        <w:t>Images</w:t>
+      </w:r>
+      <w:r>
+        <w:rPr>
+          <w:rFonts w:ascii="Sakkal Majalla" w:hAnsi="Sakkal Majalla" w:cs="Sakkal Majalla"/>
+          <w:sz w:val="28"/>
+          <w:szCs w:val="28"/>
+        </w:rPr>
+        <w:t>:</w:t>
+      </w:r>
+      <w:r>
+        <w:rPr>
+          <w:rFonts w:ascii="Sakkal Majalla" w:hAnsi="Sakkal Majalla" w:cs="Sakkal Majalla"/>
+          <w:sz w:val="28"/>
+          <w:szCs w:val="28"/>
+        </w:rPr>
+        <w:t xml:space="preserve"> To style images, we can use a bunch of Tailwind classes, such as </w:t>
+      </w:r>
       <w:r>
         <w:rPr>
           <w:rFonts w:ascii="Sakkal Majalla" w:hAnsi="Sakkal Majalla" w:cs="Sakkal Majalla"/>
           <w:b/>
           <w:bCs/>
-          <w:color w:val="C45911" w:themeColor="accent2" w:themeShade="BF"/>
-          <w:sz w:val="28"/>
-          <w:szCs w:val="28"/>
-        </w:rPr>
-        <w:t>fas</w:t>
-      </w:r>
-      <w:proofErr w:type="spellEnd"/>
-      <w:r>
-        <w:rPr>
-          <w:rFonts w:ascii="Sakkal Majalla" w:hAnsi="Sakkal Majalla" w:cs="Sakkal Majalla"/>
-          <w:color w:val="C45911" w:themeColor="accent2" w:themeShade="BF"/>
+          <w:color w:val="C00000"/>
+          <w:sz w:val="28"/>
+          <w:szCs w:val="28"/>
+        </w:rPr>
+        <w:t>width</w:t>
+      </w:r>
+      <w:r>
+        <w:rPr>
+          <w:rFonts w:ascii="Sakkal Majalla" w:hAnsi="Sakkal Majalla" w:cs="Sakkal Majalla"/>
+          <w:color w:val="C00000"/>
           <w:sz w:val="28"/>
           <w:szCs w:val="28"/>
         </w:rPr>
@@ -1510,34 +1606,18 @@
           <w:sz w:val="28"/>
           <w:szCs w:val="28"/>
         </w:rPr>
-        <w:t>placed before the icon name means that we use Font Awesome’s solid icons collectio</w:t>
-      </w:r>
-      <w:r>
-        <w:rPr>
-          <w:rFonts w:ascii="Sakkal Majalla" w:hAnsi="Sakkal Majalla" w:cs="Sakkal Majalla"/>
-          <w:sz w:val="28"/>
-          <w:szCs w:val="28"/>
-        </w:rPr>
-        <w:t>n</w:t>
-      </w:r>
-      <w:r>
-        <w:rPr>
-          <w:rFonts w:ascii="Sakkal Majalla" w:hAnsi="Sakkal Majalla" w:cs="Sakkal Majalla"/>
-          <w:sz w:val="28"/>
-          <w:szCs w:val="28"/>
-        </w:rPr>
-        <w:t xml:space="preserve">. Font Awesome offers some base styling for its icons, but we can style them with Tailwind’s utilities (for </w:t>
+        <w:t xml:space="preserve">and </w:t>
       </w:r>
       <w:r>
         <w:rPr>
           <w:rFonts w:ascii="Sakkal Majalla" w:hAnsi="Sakkal Majalla" w:cs="Sakkal Majalla"/>
           <w:b/>
           <w:bCs/>
-          <w:color w:val="C45911" w:themeColor="accent2" w:themeShade="BF"/>
-          <w:sz w:val="28"/>
-          <w:szCs w:val="28"/>
-        </w:rPr>
-        <w:t>color</w:t>
+          <w:color w:val="C00000"/>
+          <w:sz w:val="28"/>
+          <w:szCs w:val="28"/>
+        </w:rPr>
+        <w:t>height</w:t>
       </w:r>
       <w:r>
         <w:rPr>
@@ -1552,11 +1632,11 @@
           <w:rFonts w:ascii="Sakkal Majalla" w:hAnsi="Sakkal Majalla" w:cs="Sakkal Majalla"/>
           <w:b/>
           <w:bCs/>
-          <w:color w:val="C45911" w:themeColor="accent2" w:themeShade="BF"/>
-          <w:sz w:val="28"/>
-          <w:szCs w:val="28"/>
-        </w:rPr>
-        <w:t>size</w:t>
+          <w:color w:val="C00000"/>
+          <w:sz w:val="28"/>
+          <w:szCs w:val="28"/>
+        </w:rPr>
+        <w:t>opacity</w:t>
       </w:r>
       <w:r>
         <w:rPr>
@@ -1571,29 +1651,125 @@
           <w:rFonts w:ascii="Sakkal Majalla" w:hAnsi="Sakkal Majalla" w:cs="Sakkal Majalla"/>
           <w:b/>
           <w:bCs/>
-          <w:color w:val="C45911" w:themeColor="accent2" w:themeShade="BF"/>
-          <w:sz w:val="28"/>
-          <w:szCs w:val="28"/>
-        </w:rPr>
-        <w:t>etc</w:t>
-      </w:r>
-      <w:r>
-        <w:rPr>
-          <w:rFonts w:ascii="Sakkal Majalla" w:hAnsi="Sakkal Majalla" w:cs="Sakkal Majalla"/>
-          <w:sz w:val="28"/>
-          <w:szCs w:val="28"/>
-        </w:rPr>
-        <w:t>.) as well.</w:t>
-      </w:r>
-    </w:p>
-    <w:p>
-      <w:pPr>
-        <w:rPr>
-          <w:rFonts w:ascii="Sakkal Majalla" w:hAnsi="Sakkal Majalla" w:cs="Sakkal Majalla"/>
-          <w:sz w:val="28"/>
-          <w:szCs w:val="28"/>
-        </w:rPr>
-      </w:pPr>
+          <w:color w:val="C00000"/>
+          <w:sz w:val="28"/>
+          <w:szCs w:val="28"/>
+        </w:rPr>
+        <w:t>shadows</w:t>
+      </w:r>
+      <w:r>
+        <w:rPr>
+          <w:rFonts w:ascii="Sakkal Majalla" w:hAnsi="Sakkal Majalla" w:cs="Sakkal Majalla"/>
+          <w:sz w:val="28"/>
+          <w:szCs w:val="28"/>
+        </w:rPr>
+        <w:t xml:space="preserve">, </w:t>
+      </w:r>
+      <w:r>
+        <w:rPr>
+          <w:rFonts w:ascii="Sakkal Majalla" w:hAnsi="Sakkal Majalla" w:cs="Sakkal Majalla"/>
+          <w:b/>
+          <w:bCs/>
+          <w:color w:val="C00000"/>
+          <w:sz w:val="28"/>
+          <w:szCs w:val="28"/>
+        </w:rPr>
+        <w:t>borders</w:t>
+      </w:r>
+      <w:r>
+        <w:rPr>
+          <w:rFonts w:ascii="Sakkal Majalla" w:hAnsi="Sakkal Majalla" w:cs="Sakkal Majalla"/>
+          <w:sz w:val="28"/>
+          <w:szCs w:val="28"/>
+        </w:rPr>
+        <w:t xml:space="preserve">, </w:t>
+      </w:r>
+      <w:r>
+        <w:rPr>
+          <w:rFonts w:ascii="Sakkal Majalla" w:hAnsi="Sakkal Majalla" w:cs="Sakkal Majalla"/>
+          <w:b/>
+          <w:bCs/>
+          <w:color w:val="C00000"/>
+          <w:sz w:val="28"/>
+          <w:szCs w:val="28"/>
+        </w:rPr>
+        <w:t>filters</w:t>
+      </w:r>
+      <w:r>
+        <w:rPr>
+          <w:rFonts w:ascii="Sakkal Majalla" w:hAnsi="Sakkal Majalla" w:cs="Sakkal Majalla"/>
+          <w:sz w:val="28"/>
+          <w:szCs w:val="28"/>
+        </w:rPr>
+        <w:t>, and so on.</w:t>
+      </w:r>
+    </w:p>
+    <w:p>
+      <w:pPr>
+        <w:ind w:left="720" w:firstLine="720"/>
+        <w:rPr>
+          <w:rFonts w:ascii="Sakkal Majalla" w:hAnsi="Sakkal Majalla" w:cs="Sakkal Majalla"/>
+          <w:sz w:val="28"/>
+          <w:szCs w:val="28"/>
+        </w:rPr>
+      </w:pPr>
+      <w:r>
+        <w:rPr>
+          <w:rFonts w:ascii="Sakkal Majalla" w:hAnsi="Sakkal Majalla" w:cs="Sakkal Majalla"/>
+          <w:sz w:val="28"/>
+          <w:szCs w:val="28"/>
+        </w:rPr>
+        <w:t>*************************************************</w:t>
+      </w:r>
+    </w:p>
+    <w:p>
+      <w:pPr>
+        <w:rPr>
+          <w:rFonts w:ascii="Sakkal Majalla" w:hAnsi="Sakkal Majalla" w:cs="Sakkal Majalla"/>
+          <w:sz w:val="28"/>
+          <w:szCs w:val="28"/>
+        </w:rPr>
+      </w:pPr>
+      <w:r>
+        <w:rPr>
+          <w:rFonts w:ascii="Sakkal Majalla" w:hAnsi="Sakkal Majalla" w:cs="Sakkal Majalla"/>
+          <w:sz w:val="28"/>
+          <w:szCs w:val="28"/>
+        </w:rPr>
+        <w:t>In this way</w:t>
+      </w:r>
+      <w:r>
+        <w:rPr>
+          <w:rFonts w:ascii="Sakkal Majalla" w:hAnsi="Sakkal Majalla" w:cs="Sakkal Majalla"/>
+          <w:sz w:val="28"/>
+          <w:szCs w:val="28"/>
+        </w:rPr>
+        <w:t>,</w:t>
+      </w:r>
+      <w:r>
+        <w:rPr>
+          <w:rFonts w:ascii="Sakkal Majalla" w:hAnsi="Sakkal Majalla" w:cs="Sakkal Majalla"/>
+          <w:sz w:val="28"/>
+          <w:szCs w:val="28"/>
+        </w:rPr>
+        <w:t xml:space="preserve"> we can change the width of </w:t>
+      </w:r>
+      <w:r>
+        <w:rPr>
+          <w:rFonts w:ascii="Sakkal Majalla" w:hAnsi="Sakkal Majalla" w:cs="Sakkal Majalla"/>
+          <w:sz w:val="28"/>
+          <w:szCs w:val="28"/>
+        </w:rPr>
+        <w:t xml:space="preserve">the </w:t>
+      </w:r>
+      <w:r>
+        <w:rPr>
+          <w:rFonts w:ascii="Sakkal Majalla" w:hAnsi="Sakkal Majalla" w:cs="Sakkal Majalla"/>
+          <w:sz w:val="28"/>
+          <w:szCs w:val="28"/>
+        </w:rPr>
+        <w:t xml:space="preserve">element using </w:t>
+      </w:r>
       <w:r>
         <w:rPr>
           <w:rFonts w:ascii="Sakkal Majalla" w:hAnsi="Sakkal Majalla" w:cs="Sakkal Majalla"/>
@@ -1603,223 +1779,6 @@
           <w:sz w:val="28"/>
           <w:szCs w:val="28"/>
         </w:rPr>
-        <w:t>Images</w:t>
-      </w:r>
-      <w:r>
-        <w:rPr>
-          <w:rFonts w:ascii="Sakkal Majalla" w:hAnsi="Sakkal Majalla" w:cs="Sakkal Majalla"/>
-          <w:sz w:val="28"/>
-          <w:szCs w:val="28"/>
-        </w:rPr>
-        <w:t>:</w:t>
-      </w:r>
-      <w:r>
-        <w:rPr>
-          <w:rFonts w:ascii="Sakkal Majalla" w:hAnsi="Sakkal Majalla" w:cs="Sakkal Majalla"/>
-          <w:sz w:val="28"/>
-          <w:szCs w:val="28"/>
-        </w:rPr>
-        <w:t xml:space="preserve"> To style images, we can use a bunch of Tailwind classes, such as </w:t>
-      </w:r>
-      <w:r>
-        <w:rPr>
-          <w:rFonts w:ascii="Sakkal Majalla" w:hAnsi="Sakkal Majalla" w:cs="Sakkal Majalla"/>
-          <w:b/>
-          <w:bCs/>
-          <w:color w:val="C00000"/>
-          <w:sz w:val="28"/>
-          <w:szCs w:val="28"/>
-        </w:rPr>
-        <w:t>width</w:t>
-      </w:r>
-      <w:r>
-        <w:rPr>
-          <w:rFonts w:ascii="Sakkal Majalla" w:hAnsi="Sakkal Majalla" w:cs="Sakkal Majalla"/>
-          <w:color w:val="C00000"/>
-          <w:sz w:val="28"/>
-          <w:szCs w:val="28"/>
-        </w:rPr>
-        <w:t xml:space="preserve"> </w:t>
-      </w:r>
-      <w:r>
-        <w:rPr>
-          <w:rFonts w:ascii="Sakkal Majalla" w:hAnsi="Sakkal Majalla" w:cs="Sakkal Majalla"/>
-          <w:sz w:val="28"/>
-          <w:szCs w:val="28"/>
-        </w:rPr>
-        <w:t xml:space="preserve">and </w:t>
-      </w:r>
-      <w:r>
-        <w:rPr>
-          <w:rFonts w:ascii="Sakkal Majalla" w:hAnsi="Sakkal Majalla" w:cs="Sakkal Majalla"/>
-          <w:b/>
-          <w:bCs/>
-          <w:color w:val="C00000"/>
-          <w:sz w:val="28"/>
-          <w:szCs w:val="28"/>
-        </w:rPr>
-        <w:t>height</w:t>
-      </w:r>
-      <w:r>
-        <w:rPr>
-          <w:rFonts w:ascii="Sakkal Majalla" w:hAnsi="Sakkal Majalla" w:cs="Sakkal Majalla"/>
-          <w:sz w:val="28"/>
-          <w:szCs w:val="28"/>
-        </w:rPr>
-        <w:t xml:space="preserve">, </w:t>
-      </w:r>
-      <w:r>
-        <w:rPr>
-          <w:rFonts w:ascii="Sakkal Majalla" w:hAnsi="Sakkal Majalla" w:cs="Sakkal Majalla"/>
-          <w:b/>
-          <w:bCs/>
-          <w:color w:val="C00000"/>
-          <w:sz w:val="28"/>
-          <w:szCs w:val="28"/>
-        </w:rPr>
-        <w:t>opacity</w:t>
-      </w:r>
-      <w:r>
-        <w:rPr>
-          <w:rFonts w:ascii="Sakkal Majalla" w:hAnsi="Sakkal Majalla" w:cs="Sakkal Majalla"/>
-          <w:sz w:val="28"/>
-          <w:szCs w:val="28"/>
-        </w:rPr>
-        <w:t xml:space="preserve">, </w:t>
-      </w:r>
-      <w:r>
-        <w:rPr>
-          <w:rFonts w:ascii="Sakkal Majalla" w:hAnsi="Sakkal Majalla" w:cs="Sakkal Majalla"/>
-          <w:b/>
-          <w:bCs/>
-          <w:color w:val="C00000"/>
-          <w:sz w:val="28"/>
-          <w:szCs w:val="28"/>
-        </w:rPr>
-        <w:t>shadows</w:t>
-      </w:r>
-      <w:r>
-        <w:rPr>
-          <w:rFonts w:ascii="Sakkal Majalla" w:hAnsi="Sakkal Majalla" w:cs="Sakkal Majalla"/>
-          <w:sz w:val="28"/>
-          <w:szCs w:val="28"/>
-        </w:rPr>
-        <w:t xml:space="preserve">, </w:t>
-      </w:r>
-      <w:r>
-        <w:rPr>
-          <w:rFonts w:ascii="Sakkal Majalla" w:hAnsi="Sakkal Majalla" w:cs="Sakkal Majalla"/>
-          <w:b/>
-          <w:bCs/>
-          <w:color w:val="C00000"/>
-          <w:sz w:val="28"/>
-          <w:szCs w:val="28"/>
-        </w:rPr>
-        <w:t>borders</w:t>
-      </w:r>
-      <w:r>
-        <w:rPr>
-          <w:rFonts w:ascii="Sakkal Majalla" w:hAnsi="Sakkal Majalla" w:cs="Sakkal Majalla"/>
-          <w:sz w:val="28"/>
-          <w:szCs w:val="28"/>
-        </w:rPr>
-        <w:t xml:space="preserve">, </w:t>
-      </w:r>
-      <w:r>
-        <w:rPr>
-          <w:rFonts w:ascii="Sakkal Majalla" w:hAnsi="Sakkal Majalla" w:cs="Sakkal Majalla"/>
-          <w:b/>
-          <w:bCs/>
-          <w:color w:val="C00000"/>
-          <w:sz w:val="28"/>
-          <w:szCs w:val="28"/>
-        </w:rPr>
-        <w:t>filters</w:t>
-      </w:r>
-      <w:r>
-        <w:rPr>
-          <w:rFonts w:ascii="Sakkal Majalla" w:hAnsi="Sakkal Majalla" w:cs="Sakkal Majalla"/>
-          <w:sz w:val="28"/>
-          <w:szCs w:val="28"/>
-        </w:rPr>
-        <w:t>, and so on.</w:t>
-      </w:r>
-    </w:p>
-    <w:p>
-      <w:pPr>
-        <w:ind w:left="720" w:firstLine="720"/>
-        <w:rPr>
-          <w:rFonts w:ascii="Sakkal Majalla" w:hAnsi="Sakkal Majalla" w:cs="Sakkal Majalla"/>
-          <w:sz w:val="28"/>
-          <w:szCs w:val="28"/>
-        </w:rPr>
-      </w:pPr>
-      <w:r>
-        <w:rPr>
-          <w:rFonts w:ascii="Sakkal Majalla" w:hAnsi="Sakkal Majalla" w:cs="Sakkal Majalla"/>
-          <w:sz w:val="28"/>
-          <w:szCs w:val="28"/>
-        </w:rPr>
-        <w:t>*************************************************</w:t>
-      </w:r>
-    </w:p>
-    <w:p>
-      <w:pPr>
-        <w:rPr>
-          <w:rFonts w:ascii="Sakkal Majalla" w:hAnsi="Sakkal Majalla" w:cs="Sakkal Majalla"/>
-          <w:sz w:val="28"/>
-          <w:szCs w:val="28"/>
-        </w:rPr>
-      </w:pPr>
-      <w:r>
-        <w:rPr>
-          <w:rFonts w:ascii="Sakkal Majalla" w:hAnsi="Sakkal Majalla" w:cs="Sakkal Majalla"/>
-          <w:sz w:val="28"/>
-          <w:szCs w:val="28"/>
-        </w:rPr>
-        <w:t>In this way</w:t>
-      </w:r>
-      <w:r>
-        <w:rPr>
-          <w:rFonts w:ascii="Sakkal Majalla" w:hAnsi="Sakkal Majalla" w:cs="Sakkal Majalla"/>
-          <w:sz w:val="28"/>
-          <w:szCs w:val="28"/>
-        </w:rPr>
-        <w:t>,</w:t>
-      </w:r>
-      <w:r>
-        <w:rPr>
-          <w:rFonts w:ascii="Sakkal Majalla" w:hAnsi="Sakkal Majalla" w:cs="Sakkal Majalla"/>
-          <w:sz w:val="28"/>
-          <w:szCs w:val="28"/>
-        </w:rPr>
-        <w:t xml:space="preserve"> we can change the width of </w:t>
-      </w:r>
-      <w:r>
-        <w:rPr>
-          <w:rFonts w:ascii="Sakkal Majalla" w:hAnsi="Sakkal Majalla" w:cs="Sakkal Majalla"/>
-          <w:sz w:val="28"/>
-          <w:szCs w:val="28"/>
-        </w:rPr>
-        <w:t xml:space="preserve">the </w:t>
-      </w:r>
-      <w:r>
-        <w:rPr>
-          <w:rFonts w:ascii="Sakkal Majalla" w:hAnsi="Sakkal Majalla" w:cs="Sakkal Majalla"/>
-          <w:sz w:val="28"/>
-          <w:szCs w:val="28"/>
-        </w:rPr>
-        <w:t xml:space="preserve">element using </w:t>
-      </w:r>
-      <w:r>
-        <w:rPr>
-          <w:rFonts w:ascii="Sakkal Majalla" w:hAnsi="Sakkal Majalla" w:cs="Sakkal Majalla"/>
-          <w:b/>
-          <w:bCs/>
-          <w:color w:val="0070C0"/>
-          <w:sz w:val="28"/>
-          <w:szCs w:val="28"/>
-        </w:rPr>
         <w:t>w-2/3</w:t>
       </w:r>
       <w:r>
@@ -2290,6 +2249,1884 @@
           <w14:ligatures w14:val="none"/>
         </w:rPr>
         <w:t>&lt;/div&gt;</w:t>
+      </w:r>
+    </w:p>
+    <w:p>
+      <w:pPr>
+        <w:ind w:left="720" w:firstLine="720"/>
+        <w:rPr>
+          <w:rFonts w:ascii="Sakkal Majalla" w:hAnsi="Sakkal Majalla" w:cs="Sakkal Majalla"/>
+          <w:sz w:val="28"/>
+          <w:szCs w:val="28"/>
+        </w:rPr>
+      </w:pPr>
+      <w:r>
+        <w:rPr>
+          <w:rFonts w:ascii="Sakkal Majalla" w:hAnsi="Sakkal Majalla" w:cs="Sakkal Majalla"/>
+          <w:sz w:val="28"/>
+          <w:szCs w:val="28"/>
+        </w:rPr>
+        <w:t>*************************************************</w:t>
+      </w:r>
+    </w:p>
+    <w:p>
+      <w:pPr>
+        <w:rPr>
+          <w:rFonts w:ascii="Sakkal Majalla" w:hAnsi="Sakkal Majalla" w:cs="Sakkal Majalla"/>
+          <w:sz w:val="28"/>
+          <w:szCs w:val="28"/>
+        </w:rPr>
+      </w:pPr>
+    </w:p>
+    <w:p>
+      <w:pPr>
+        <w:rPr>
+          <w:rFonts w:ascii="Sakkal Majalla" w:hAnsi="Sakkal Majalla" w:cs="Sakkal Majalla"/>
+          <w:sz w:val="28"/>
+          <w:szCs w:val="28"/>
+        </w:rPr>
+      </w:pPr>
+    </w:p>
+    <w:p>
+      <w:pPr>
+        <w:rPr>
+          <w:rFonts w:ascii="Sakkal Majalla" w:hAnsi="Sakkal Majalla" w:cs="Sakkal Majalla"/>
+          <w:sz w:val="28"/>
+          <w:szCs w:val="28"/>
+        </w:rPr>
+      </w:pPr>
+    </w:p>
+    <w:p>
+      <w:pPr>
+        <w:rPr>
+          <w:rFonts w:ascii="Sakkal Majalla" w:hAnsi="Sakkal Majalla" w:cs="Sakkal Majalla"/>
+          <w:sz w:val="28"/>
+          <w:szCs w:val="28"/>
+        </w:rPr>
+      </w:pPr>
+    </w:p>
+    <w:p>
+      <w:pPr>
+        <w:rPr>
+          <w:rFonts w:ascii="Sakkal Majalla" w:hAnsi="Sakkal Majalla" w:cs="Sakkal Majalla"/>
+          <w:sz w:val="28"/>
+          <w:szCs w:val="28"/>
+        </w:rPr>
+      </w:pPr>
+    </w:p>
+    <w:p>
+      <w:pPr>
+        <w:rPr>
+          <w:rFonts w:ascii="Sakkal Majalla" w:hAnsi="Sakkal Majalla" w:cs="Sakkal Majalla"/>
+          <w:sz w:val="28"/>
+          <w:szCs w:val="28"/>
+        </w:rPr>
+      </w:pPr>
+    </w:p>
+    <w:p>
+      <w:pPr>
+        <w:rPr>
+          <w:rFonts w:ascii="Sakkal Majalla" w:hAnsi="Sakkal Majalla" w:cs="Sakkal Majalla"/>
+          <w:sz w:val="28"/>
+          <w:szCs w:val="28"/>
+        </w:rPr>
+      </w:pPr>
+    </w:p>
+    <w:p>
+      <w:pPr>
+        <w:rPr>
+          <w:rFonts w:ascii="Sakkal Majalla" w:hAnsi="Sakkal Majalla" w:cs="Sakkal Majalla"/>
+          <w:sz w:val="28"/>
+          <w:szCs w:val="28"/>
+        </w:rPr>
+      </w:pPr>
+      <w:r>
+        <w:rPr>
+          <w:rFonts w:ascii="Sakkal Majalla" w:hAnsi="Sakkal Majalla" w:cs="Sakkal Majalla"/>
+          <w:sz w:val="28"/>
+          <w:szCs w:val="28"/>
+        </w:rPr>
+        <w:lastRenderedPageBreak/>
+        <w:t xml:space="preserve">To add </w:t>
+      </w:r>
+      <w:r>
+        <w:rPr>
+          <w:rFonts w:ascii="Sakkal Majalla" w:hAnsi="Sakkal Majalla" w:cs="Sakkal Majalla"/>
+          <w:sz w:val="28"/>
+          <w:szCs w:val="28"/>
+        </w:rPr>
+        <w:t xml:space="preserve">a </w:t>
+      </w:r>
+      <w:r>
+        <w:rPr>
+          <w:rFonts w:ascii="Sakkal Majalla" w:hAnsi="Sakkal Majalla" w:cs="Sakkal Majalla"/>
+          <w:sz w:val="28"/>
+          <w:szCs w:val="28"/>
+        </w:rPr>
+        <w:t>reusable component using TailwindCSS:</w:t>
+      </w:r>
+    </w:p>
+    <w:p>
+      <w:pPr>
+        <w:shd w:val="clear" w:color="auto" w:fill="FFFFFF"/>
+        <w:spacing w:after="0" w:line="285" w:lineRule="atLeast"/>
+        <w:rPr>
+          <w:rFonts w:ascii="Consolas" w:eastAsia="Times New Roman" w:hAnsi="Consolas" w:cs="Times New Roman"/>
+          <w:color w:val="3B3B3B"/>
+          <w:kern w:val="0"/>
+          <w:sz w:val="21"/>
+          <w:szCs w:val="21"/>
+          <w14:ligatures w14:val="none"/>
+        </w:rPr>
+      </w:pPr>
+      <w:r>
+        <w:rPr>
+          <w:rFonts w:ascii="Consolas" w:eastAsia="Times New Roman" w:hAnsi="Consolas" w:cs="Times New Roman"/>
+          <w:color w:val="AF00DB"/>
+          <w:kern w:val="0"/>
+          <w:sz w:val="21"/>
+          <w:szCs w:val="21"/>
+          <w14:ligatures w14:val="none"/>
+        </w:rPr>
+        <w:t>@import</w:t>
+      </w:r>
+      <w:r>
+        <w:rPr>
+          <w:rFonts w:ascii="Consolas" w:eastAsia="Times New Roman" w:hAnsi="Consolas" w:cs="Times New Roman"/>
+          <w:color w:val="3B3B3B"/>
+          <w:kern w:val="0"/>
+          <w:sz w:val="21"/>
+          <w:szCs w:val="21"/>
+          <w14:ligatures w14:val="none"/>
+        </w:rPr>
+        <w:t xml:space="preserve"> </w:t>
+      </w:r>
+      <w:r>
+        <w:rPr>
+          <w:rFonts w:ascii="Consolas" w:eastAsia="Times New Roman" w:hAnsi="Consolas" w:cs="Times New Roman"/>
+          <w:color w:val="A31515"/>
+          <w:kern w:val="0"/>
+          <w:sz w:val="21"/>
+          <w:szCs w:val="21"/>
+          <w14:ligatures w14:val="none"/>
+        </w:rPr>
+        <w:t>"tailwindcss"</w:t>
+      </w:r>
+      <w:r>
+        <w:rPr>
+          <w:rFonts w:ascii="Consolas" w:eastAsia="Times New Roman" w:hAnsi="Consolas" w:cs="Times New Roman"/>
+          <w:color w:val="3B3B3B"/>
+          <w:kern w:val="0"/>
+          <w:sz w:val="21"/>
+          <w:szCs w:val="21"/>
+          <w14:ligatures w14:val="none"/>
+        </w:rPr>
+        <w:t>;</w:t>
+      </w:r>
+    </w:p>
+    <w:p>
+      <w:pPr>
+        <w:shd w:val="clear" w:color="auto" w:fill="FFFFFF"/>
+        <w:spacing w:after="0" w:line="285" w:lineRule="atLeast"/>
+        <w:rPr>
+          <w:rFonts w:ascii="Consolas" w:eastAsia="Times New Roman" w:hAnsi="Consolas" w:cs="Times New Roman"/>
+          <w:color w:val="3B3B3B"/>
+          <w:kern w:val="0"/>
+          <w:sz w:val="21"/>
+          <w:szCs w:val="21"/>
+          <w14:ligatures w14:val="none"/>
+        </w:rPr>
+      </w:pPr>
+    </w:p>
+    <w:p>
+      <w:pPr>
+        <w:shd w:val="clear" w:color="auto" w:fill="FFFFFF"/>
+        <w:spacing w:after="0" w:line="285" w:lineRule="atLeast"/>
+        <w:rPr>
+          <w:rFonts w:ascii="Consolas" w:eastAsia="Times New Roman" w:hAnsi="Consolas" w:cs="Times New Roman"/>
+          <w:color w:val="3B3B3B"/>
+          <w:kern w:val="0"/>
+          <w:sz w:val="21"/>
+          <w:szCs w:val="21"/>
+          <w14:ligatures w14:val="none"/>
+        </w:rPr>
+      </w:pPr>
+      <w:r>
+        <w:rPr>
+          <w:rFonts w:ascii="Consolas" w:eastAsia="Times New Roman" w:hAnsi="Consolas" w:cs="Times New Roman"/>
+          <w:color w:val="AF00DB"/>
+          <w:kern w:val="0"/>
+          <w:sz w:val="21"/>
+          <w:szCs w:val="21"/>
+          <w14:ligatures w14:val="none"/>
+        </w:rPr>
+        <w:t>@layer</w:t>
+      </w:r>
+      <w:r>
+        <w:rPr>
+          <w:rFonts w:ascii="Consolas" w:eastAsia="Times New Roman" w:hAnsi="Consolas" w:cs="Times New Roman"/>
+          <w:color w:val="3B3B3B"/>
+          <w:kern w:val="0"/>
+          <w:sz w:val="21"/>
+          <w:szCs w:val="21"/>
+          <w14:ligatures w14:val="none"/>
+        </w:rPr>
+        <w:t xml:space="preserve"> </w:t>
+      </w:r>
+      <w:r>
+        <w:rPr>
+          <w:rFonts w:ascii="Consolas" w:eastAsia="Times New Roman" w:hAnsi="Consolas" w:cs="Times New Roman"/>
+          <w:color w:val="E50000"/>
+          <w:kern w:val="0"/>
+          <w:sz w:val="21"/>
+          <w:szCs w:val="21"/>
+          <w14:ligatures w14:val="none"/>
+        </w:rPr>
+        <w:t>components</w:t>
+      </w:r>
+      <w:r>
+        <w:rPr>
+          <w:rFonts w:ascii="Consolas" w:eastAsia="Times New Roman" w:hAnsi="Consolas" w:cs="Times New Roman"/>
+          <w:color w:val="3B3B3B"/>
+          <w:kern w:val="0"/>
+          <w:sz w:val="21"/>
+          <w:szCs w:val="21"/>
+          <w14:ligatures w14:val="none"/>
+        </w:rPr>
+        <w:t xml:space="preserve"> {</w:t>
+      </w:r>
+    </w:p>
+    <w:p>
+      <w:pPr>
+        <w:shd w:val="clear" w:color="auto" w:fill="FFFFFF"/>
+        <w:spacing w:after="0" w:line="285" w:lineRule="atLeast"/>
+        <w:rPr>
+          <w:rFonts w:ascii="Consolas" w:eastAsia="Times New Roman" w:hAnsi="Consolas" w:cs="Times New Roman"/>
+          <w:color w:val="3B3B3B"/>
+          <w:kern w:val="0"/>
+          <w:sz w:val="21"/>
+          <w:szCs w:val="21"/>
+          <w14:ligatures w14:val="none"/>
+        </w:rPr>
+      </w:pPr>
+      <w:r>
+        <w:rPr>
+          <w:rFonts w:ascii="Consolas" w:eastAsia="Times New Roman" w:hAnsi="Consolas" w:cs="Times New Roman"/>
+          <w:color w:val="3B3B3B"/>
+          <w:kern w:val="0"/>
+          <w:sz w:val="21"/>
+          <w:szCs w:val="21"/>
+          <w14:ligatures w14:val="none"/>
+        </w:rPr>
+        <w:t xml:space="preserve">    </w:t>
+      </w:r>
+      <w:proofErr w:type="gramStart"/>
+      <w:r>
+        <w:rPr>
+          <w:rFonts w:ascii="Consolas" w:eastAsia="Times New Roman" w:hAnsi="Consolas" w:cs="Times New Roman"/>
+          <w:color w:val="800000"/>
+          <w:kern w:val="0"/>
+          <w:sz w:val="21"/>
+          <w:szCs w:val="21"/>
+          <w14:ligatures w14:val="none"/>
+        </w:rPr>
+        <w:t>.alert</w:t>
+      </w:r>
+      <w:proofErr w:type="gramEnd"/>
+      <w:r>
+        <w:rPr>
+          <w:rFonts w:ascii="Consolas" w:eastAsia="Times New Roman" w:hAnsi="Consolas" w:cs="Times New Roman"/>
+          <w:color w:val="3B3B3B"/>
+          <w:kern w:val="0"/>
+          <w:sz w:val="21"/>
+          <w:szCs w:val="21"/>
+          <w14:ligatures w14:val="none"/>
+        </w:rPr>
+        <w:t xml:space="preserve"> {</w:t>
+      </w:r>
+    </w:p>
+    <w:p>
+      <w:pPr>
+        <w:shd w:val="clear" w:color="auto" w:fill="FFFFFF"/>
+        <w:spacing w:after="0" w:line="285" w:lineRule="atLeast"/>
+        <w:rPr>
+          <w:rFonts w:ascii="Consolas" w:eastAsia="Times New Roman" w:hAnsi="Consolas" w:cs="Times New Roman"/>
+          <w:color w:val="3B3B3B"/>
+          <w:kern w:val="0"/>
+          <w:sz w:val="21"/>
+          <w:szCs w:val="21"/>
+          <w14:ligatures w14:val="none"/>
+        </w:rPr>
+      </w:pPr>
+      <w:r>
+        <w:rPr>
+          <w:rFonts w:ascii="Consolas" w:eastAsia="Times New Roman" w:hAnsi="Consolas" w:cs="Times New Roman"/>
+          <w:color w:val="3B3B3B"/>
+          <w:kern w:val="0"/>
+          <w:sz w:val="21"/>
+          <w:szCs w:val="21"/>
+          <w14:ligatures w14:val="none"/>
+        </w:rPr>
+        <w:t xml:space="preserve">        </w:t>
+      </w:r>
+      <w:r>
+        <w:rPr>
+          <w:rFonts w:ascii="Consolas" w:eastAsia="Times New Roman" w:hAnsi="Consolas" w:cs="Times New Roman"/>
+          <w:color w:val="AF00DB"/>
+          <w:kern w:val="0"/>
+          <w:sz w:val="21"/>
+          <w:szCs w:val="21"/>
+          <w14:ligatures w14:val="none"/>
+        </w:rPr>
+        <w:t>@apply</w:t>
+      </w:r>
+      <w:r>
+        <w:rPr>
+          <w:rFonts w:ascii="Consolas" w:eastAsia="Times New Roman" w:hAnsi="Consolas" w:cs="Times New Roman"/>
+          <w:color w:val="3B3B3B"/>
+          <w:kern w:val="0"/>
+          <w:sz w:val="21"/>
+          <w:szCs w:val="21"/>
+          <w14:ligatures w14:val="none"/>
+        </w:rPr>
+        <w:t xml:space="preserve"> </w:t>
+      </w:r>
+      <w:r>
+        <w:rPr>
+          <w:rFonts w:ascii="Consolas" w:eastAsia="Times New Roman" w:hAnsi="Consolas" w:cs="Times New Roman"/>
+          <w:color w:val="800000"/>
+          <w:kern w:val="0"/>
+          <w:sz w:val="21"/>
+          <w:szCs w:val="21"/>
+          <w14:ligatures w14:val="none"/>
+        </w:rPr>
+        <w:t>flex</w:t>
+      </w:r>
+      <w:r>
+        <w:rPr>
+          <w:rFonts w:ascii="Consolas" w:eastAsia="Times New Roman" w:hAnsi="Consolas" w:cs="Times New Roman"/>
+          <w:color w:val="3B3B3B"/>
+          <w:kern w:val="0"/>
+          <w:sz w:val="21"/>
+          <w:szCs w:val="21"/>
+          <w14:ligatures w14:val="none"/>
+        </w:rPr>
+        <w:t xml:space="preserve"> </w:t>
+      </w:r>
+      <w:r>
+        <w:rPr>
+          <w:rFonts w:ascii="Consolas" w:eastAsia="Times New Roman" w:hAnsi="Consolas" w:cs="Times New Roman"/>
+          <w:color w:val="800000"/>
+          <w:kern w:val="0"/>
+          <w:sz w:val="21"/>
+          <w:szCs w:val="21"/>
+          <w14:ligatures w14:val="none"/>
+        </w:rPr>
+        <w:t>flex-col</w:t>
+      </w:r>
+      <w:r>
+        <w:rPr>
+          <w:rFonts w:ascii="Consolas" w:eastAsia="Times New Roman" w:hAnsi="Consolas" w:cs="Times New Roman"/>
+          <w:color w:val="3B3B3B"/>
+          <w:kern w:val="0"/>
+          <w:sz w:val="21"/>
+          <w:szCs w:val="21"/>
+          <w14:ligatures w14:val="none"/>
+        </w:rPr>
+        <w:t xml:space="preserve"> </w:t>
+      </w:r>
+      <w:r>
+        <w:rPr>
+          <w:rFonts w:ascii="Consolas" w:eastAsia="Times New Roman" w:hAnsi="Consolas" w:cs="Times New Roman"/>
+          <w:color w:val="800000"/>
+          <w:kern w:val="0"/>
+          <w:sz w:val="21"/>
+          <w:szCs w:val="21"/>
+          <w14:ligatures w14:val="none"/>
+        </w:rPr>
+        <w:t>p-4</w:t>
+      </w:r>
+      <w:r>
+        <w:rPr>
+          <w:rFonts w:ascii="Consolas" w:eastAsia="Times New Roman" w:hAnsi="Consolas" w:cs="Times New Roman"/>
+          <w:color w:val="3B3B3B"/>
+          <w:kern w:val="0"/>
+          <w:sz w:val="21"/>
+          <w:szCs w:val="21"/>
+          <w14:ligatures w14:val="none"/>
+        </w:rPr>
+        <w:t xml:space="preserve"> </w:t>
+      </w:r>
+      <w:r>
+        <w:rPr>
+          <w:rFonts w:ascii="Consolas" w:eastAsia="Times New Roman" w:hAnsi="Consolas" w:cs="Times New Roman"/>
+          <w:color w:val="800000"/>
+          <w:kern w:val="0"/>
+          <w:sz w:val="21"/>
+          <w:szCs w:val="21"/>
+          <w14:ligatures w14:val="none"/>
+        </w:rPr>
+        <w:t>pt-2</w:t>
+      </w:r>
+      <w:r>
+        <w:rPr>
+          <w:rFonts w:ascii="Consolas" w:eastAsia="Times New Roman" w:hAnsi="Consolas" w:cs="Times New Roman"/>
+          <w:color w:val="3B3B3B"/>
+          <w:kern w:val="0"/>
+          <w:sz w:val="21"/>
+          <w:szCs w:val="21"/>
+          <w14:ligatures w14:val="none"/>
+        </w:rPr>
+        <w:t xml:space="preserve"> </w:t>
+      </w:r>
+      <w:r>
+        <w:rPr>
+          <w:rFonts w:ascii="Consolas" w:eastAsia="Times New Roman" w:hAnsi="Consolas" w:cs="Times New Roman"/>
+          <w:color w:val="800000"/>
+          <w:kern w:val="0"/>
+          <w:sz w:val="21"/>
+          <w:szCs w:val="21"/>
+          <w14:ligatures w14:val="none"/>
+        </w:rPr>
+        <w:t>w-full</w:t>
+      </w:r>
+      <w:r>
+        <w:rPr>
+          <w:rFonts w:ascii="Consolas" w:eastAsia="Times New Roman" w:hAnsi="Consolas" w:cs="Times New Roman"/>
+          <w:color w:val="3B3B3B"/>
+          <w:kern w:val="0"/>
+          <w:sz w:val="21"/>
+          <w:szCs w:val="21"/>
+          <w14:ligatures w14:val="none"/>
+        </w:rPr>
+        <w:t xml:space="preserve"> </w:t>
+      </w:r>
+      <w:r>
+        <w:rPr>
+          <w:rFonts w:ascii="Consolas" w:eastAsia="Times New Roman" w:hAnsi="Consolas" w:cs="Times New Roman"/>
+          <w:color w:val="800000"/>
+          <w:kern w:val="0"/>
+          <w:sz w:val="21"/>
+          <w:szCs w:val="21"/>
+          <w14:ligatures w14:val="none"/>
+        </w:rPr>
+        <w:t>border-l-8</w:t>
+      </w:r>
+    </w:p>
+    <w:p>
+      <w:pPr>
+        <w:shd w:val="clear" w:color="auto" w:fill="FFFFFF"/>
+        <w:spacing w:after="0" w:line="285" w:lineRule="atLeast"/>
+        <w:rPr>
+          <w:rFonts w:ascii="Consolas" w:eastAsia="Times New Roman" w:hAnsi="Consolas" w:cs="Times New Roman"/>
+          <w:color w:val="3B3B3B"/>
+          <w:kern w:val="0"/>
+          <w:sz w:val="21"/>
+          <w:szCs w:val="21"/>
+          <w14:ligatures w14:val="none"/>
+        </w:rPr>
+      </w:pPr>
+      <w:r>
+        <w:rPr>
+          <w:rFonts w:ascii="Consolas" w:eastAsia="Times New Roman" w:hAnsi="Consolas" w:cs="Times New Roman"/>
+          <w:color w:val="3B3B3B"/>
+          <w:kern w:val="0"/>
+          <w:sz w:val="21"/>
+          <w:szCs w:val="21"/>
+          <w14:ligatures w14:val="none"/>
+        </w:rPr>
+        <w:t>    }</w:t>
+      </w:r>
+    </w:p>
+    <w:p>
+      <w:pPr>
+        <w:shd w:val="clear" w:color="auto" w:fill="FFFFFF"/>
+        <w:spacing w:after="0" w:line="285" w:lineRule="atLeast"/>
+        <w:rPr>
+          <w:rFonts w:ascii="Consolas" w:eastAsia="Times New Roman" w:hAnsi="Consolas" w:cs="Times New Roman"/>
+          <w:color w:val="3B3B3B"/>
+          <w:kern w:val="0"/>
+          <w:sz w:val="21"/>
+          <w:szCs w:val="21"/>
+          <w14:ligatures w14:val="none"/>
+        </w:rPr>
+      </w:pPr>
+    </w:p>
+    <w:p>
+      <w:pPr>
+        <w:shd w:val="clear" w:color="auto" w:fill="FFFFFF"/>
+        <w:spacing w:after="0" w:line="285" w:lineRule="atLeast"/>
+        <w:rPr>
+          <w:rFonts w:ascii="Consolas" w:eastAsia="Times New Roman" w:hAnsi="Consolas" w:cs="Times New Roman"/>
+          <w:color w:val="3B3B3B"/>
+          <w:kern w:val="0"/>
+          <w:sz w:val="21"/>
+          <w:szCs w:val="21"/>
+          <w14:ligatures w14:val="none"/>
+        </w:rPr>
+      </w:pPr>
+      <w:r>
+        <w:rPr>
+          <w:rFonts w:ascii="Consolas" w:eastAsia="Times New Roman" w:hAnsi="Consolas" w:cs="Times New Roman"/>
+          <w:color w:val="3B3B3B"/>
+          <w:kern w:val="0"/>
+          <w:sz w:val="21"/>
+          <w:szCs w:val="21"/>
+          <w14:ligatures w14:val="none"/>
+        </w:rPr>
+        <w:t xml:space="preserve">    </w:t>
+      </w:r>
+      <w:proofErr w:type="gramStart"/>
+      <w:r>
+        <w:rPr>
+          <w:rFonts w:ascii="Consolas" w:eastAsia="Times New Roman" w:hAnsi="Consolas" w:cs="Times New Roman"/>
+          <w:color w:val="800000"/>
+          <w:kern w:val="0"/>
+          <w:sz w:val="21"/>
+          <w:szCs w:val="21"/>
+          <w14:ligatures w14:val="none"/>
+        </w:rPr>
+        <w:t>.alert</w:t>
+      </w:r>
+      <w:proofErr w:type="gramEnd"/>
+      <w:r>
+        <w:rPr>
+          <w:rFonts w:ascii="Consolas" w:eastAsia="Times New Roman" w:hAnsi="Consolas" w:cs="Times New Roman"/>
+          <w:color w:val="800000"/>
+          <w:kern w:val="0"/>
+          <w:sz w:val="21"/>
+          <w:szCs w:val="21"/>
+          <w14:ligatures w14:val="none"/>
+        </w:rPr>
+        <w:t>-title</w:t>
+      </w:r>
+      <w:r>
+        <w:rPr>
+          <w:rFonts w:ascii="Consolas" w:eastAsia="Times New Roman" w:hAnsi="Consolas" w:cs="Times New Roman"/>
+          <w:color w:val="3B3B3B"/>
+          <w:kern w:val="0"/>
+          <w:sz w:val="21"/>
+          <w:szCs w:val="21"/>
+          <w14:ligatures w14:val="none"/>
+        </w:rPr>
+        <w:t xml:space="preserve"> {</w:t>
+      </w:r>
+    </w:p>
+    <w:p>
+      <w:pPr>
+        <w:shd w:val="clear" w:color="auto" w:fill="FFFFFF"/>
+        <w:spacing w:after="0" w:line="285" w:lineRule="atLeast"/>
+        <w:rPr>
+          <w:rFonts w:ascii="Consolas" w:eastAsia="Times New Roman" w:hAnsi="Consolas" w:cs="Times New Roman"/>
+          <w:color w:val="3B3B3B"/>
+          <w:kern w:val="0"/>
+          <w:sz w:val="21"/>
+          <w:szCs w:val="21"/>
+          <w14:ligatures w14:val="none"/>
+        </w:rPr>
+      </w:pPr>
+      <w:r>
+        <w:rPr>
+          <w:rFonts w:ascii="Consolas" w:eastAsia="Times New Roman" w:hAnsi="Consolas" w:cs="Times New Roman"/>
+          <w:color w:val="3B3B3B"/>
+          <w:kern w:val="0"/>
+          <w:sz w:val="21"/>
+          <w:szCs w:val="21"/>
+          <w14:ligatures w14:val="none"/>
+        </w:rPr>
+        <w:t xml:space="preserve">        </w:t>
+      </w:r>
+      <w:r>
+        <w:rPr>
+          <w:rFonts w:ascii="Consolas" w:eastAsia="Times New Roman" w:hAnsi="Consolas" w:cs="Times New Roman"/>
+          <w:color w:val="AF00DB"/>
+          <w:kern w:val="0"/>
+          <w:sz w:val="21"/>
+          <w:szCs w:val="21"/>
+          <w14:ligatures w14:val="none"/>
+        </w:rPr>
+        <w:t>@apply</w:t>
+      </w:r>
+      <w:r>
+        <w:rPr>
+          <w:rFonts w:ascii="Consolas" w:eastAsia="Times New Roman" w:hAnsi="Consolas" w:cs="Times New Roman"/>
+          <w:color w:val="3B3B3B"/>
+          <w:kern w:val="0"/>
+          <w:sz w:val="21"/>
+          <w:szCs w:val="21"/>
+          <w14:ligatures w14:val="none"/>
+        </w:rPr>
+        <w:t xml:space="preserve"> </w:t>
+      </w:r>
+      <w:r>
+        <w:rPr>
+          <w:rFonts w:ascii="Consolas" w:eastAsia="Times New Roman" w:hAnsi="Consolas" w:cs="Times New Roman"/>
+          <w:color w:val="800000"/>
+          <w:kern w:val="0"/>
+          <w:sz w:val="21"/>
+          <w:szCs w:val="21"/>
+          <w14:ligatures w14:val="none"/>
+        </w:rPr>
+        <w:t>font-semibold</w:t>
+      </w:r>
+      <w:r>
+        <w:rPr>
+          <w:rFonts w:ascii="Consolas" w:eastAsia="Times New Roman" w:hAnsi="Consolas" w:cs="Times New Roman"/>
+          <w:color w:val="3B3B3B"/>
+          <w:kern w:val="0"/>
+          <w:sz w:val="21"/>
+          <w:szCs w:val="21"/>
+          <w14:ligatures w14:val="none"/>
+        </w:rPr>
+        <w:t xml:space="preserve"> </w:t>
+      </w:r>
+      <w:r>
+        <w:rPr>
+          <w:rFonts w:ascii="Consolas" w:eastAsia="Times New Roman" w:hAnsi="Consolas" w:cs="Times New Roman"/>
+          <w:color w:val="800000"/>
+          <w:kern w:val="0"/>
+          <w:sz w:val="21"/>
+          <w:szCs w:val="21"/>
+          <w14:ligatures w14:val="none"/>
+        </w:rPr>
+        <w:t>italic</w:t>
+      </w:r>
+      <w:r>
+        <w:rPr>
+          <w:rFonts w:ascii="Consolas" w:eastAsia="Times New Roman" w:hAnsi="Consolas" w:cs="Times New Roman"/>
+          <w:color w:val="3B3B3B"/>
+          <w:kern w:val="0"/>
+          <w:sz w:val="21"/>
+          <w:szCs w:val="21"/>
+          <w14:ligatures w14:val="none"/>
+        </w:rPr>
+        <w:t xml:space="preserve"> </w:t>
+      </w:r>
+      <w:r>
+        <w:rPr>
+          <w:rFonts w:ascii="Consolas" w:eastAsia="Times New Roman" w:hAnsi="Consolas" w:cs="Times New Roman"/>
+          <w:color w:val="800000"/>
+          <w:kern w:val="0"/>
+          <w:sz w:val="21"/>
+          <w:szCs w:val="21"/>
+          <w14:ligatures w14:val="none"/>
+        </w:rPr>
+        <w:t>text-lg</w:t>
+      </w:r>
+    </w:p>
+    <w:p>
+      <w:pPr>
+        <w:shd w:val="clear" w:color="auto" w:fill="FFFFFF"/>
+        <w:spacing w:after="0" w:line="285" w:lineRule="atLeast"/>
+        <w:rPr>
+          <w:rFonts w:ascii="Consolas" w:eastAsia="Times New Roman" w:hAnsi="Consolas" w:cs="Times New Roman"/>
+          <w:color w:val="3B3B3B"/>
+          <w:kern w:val="0"/>
+          <w:sz w:val="21"/>
+          <w:szCs w:val="21"/>
+          <w14:ligatures w14:val="none"/>
+        </w:rPr>
+      </w:pPr>
+      <w:r>
+        <w:rPr>
+          <w:rFonts w:ascii="Consolas" w:eastAsia="Times New Roman" w:hAnsi="Consolas" w:cs="Times New Roman"/>
+          <w:color w:val="3B3B3B"/>
+          <w:kern w:val="0"/>
+          <w:sz w:val="21"/>
+          <w:szCs w:val="21"/>
+          <w14:ligatures w14:val="none"/>
+        </w:rPr>
+        <w:t>    }</w:t>
+      </w:r>
+    </w:p>
+    <w:p>
+      <w:pPr>
+        <w:shd w:val="clear" w:color="auto" w:fill="FFFFFF"/>
+        <w:spacing w:after="0" w:line="285" w:lineRule="atLeast"/>
+        <w:rPr>
+          <w:rFonts w:ascii="Consolas" w:eastAsia="Times New Roman" w:hAnsi="Consolas" w:cs="Times New Roman"/>
+          <w:color w:val="3B3B3B"/>
+          <w:kern w:val="0"/>
+          <w:sz w:val="21"/>
+          <w:szCs w:val="21"/>
+          <w14:ligatures w14:val="none"/>
+        </w:rPr>
+      </w:pPr>
+    </w:p>
+    <w:p>
+      <w:pPr>
+        <w:shd w:val="clear" w:color="auto" w:fill="FFFFFF"/>
+        <w:spacing w:after="0" w:line="285" w:lineRule="atLeast"/>
+        <w:rPr>
+          <w:rFonts w:ascii="Consolas" w:eastAsia="Times New Roman" w:hAnsi="Consolas" w:cs="Times New Roman"/>
+          <w:color w:val="3B3B3B"/>
+          <w:kern w:val="0"/>
+          <w:sz w:val="21"/>
+          <w:szCs w:val="21"/>
+          <w14:ligatures w14:val="none"/>
+        </w:rPr>
+      </w:pPr>
+      <w:r>
+        <w:rPr>
+          <w:rFonts w:ascii="Consolas" w:eastAsia="Times New Roman" w:hAnsi="Consolas" w:cs="Times New Roman"/>
+          <w:color w:val="3B3B3B"/>
+          <w:kern w:val="0"/>
+          <w:sz w:val="21"/>
+          <w:szCs w:val="21"/>
+          <w14:ligatures w14:val="none"/>
+        </w:rPr>
+        <w:t xml:space="preserve">    </w:t>
+      </w:r>
+      <w:proofErr w:type="gramStart"/>
+      <w:r>
+        <w:rPr>
+          <w:rFonts w:ascii="Consolas" w:eastAsia="Times New Roman" w:hAnsi="Consolas" w:cs="Times New Roman"/>
+          <w:color w:val="800000"/>
+          <w:kern w:val="0"/>
+          <w:sz w:val="21"/>
+          <w:szCs w:val="21"/>
+          <w14:ligatures w14:val="none"/>
+        </w:rPr>
+        <w:t>.alert</w:t>
+      </w:r>
+      <w:proofErr w:type="gramEnd"/>
+      <w:r>
+        <w:rPr>
+          <w:rFonts w:ascii="Consolas" w:eastAsia="Times New Roman" w:hAnsi="Consolas" w:cs="Times New Roman"/>
+          <w:color w:val="800000"/>
+          <w:kern w:val="0"/>
+          <w:sz w:val="21"/>
+          <w:szCs w:val="21"/>
+          <w14:ligatures w14:val="none"/>
+        </w:rPr>
+        <w:t>-content</w:t>
+      </w:r>
+      <w:r>
+        <w:rPr>
+          <w:rFonts w:ascii="Consolas" w:eastAsia="Times New Roman" w:hAnsi="Consolas" w:cs="Times New Roman"/>
+          <w:color w:val="3B3B3B"/>
+          <w:kern w:val="0"/>
+          <w:sz w:val="21"/>
+          <w:szCs w:val="21"/>
+          <w14:ligatures w14:val="none"/>
+        </w:rPr>
+        <w:t xml:space="preserve"> {</w:t>
+      </w:r>
+    </w:p>
+    <w:p>
+      <w:pPr>
+        <w:shd w:val="clear" w:color="auto" w:fill="FFFFFF"/>
+        <w:spacing w:after="0" w:line="285" w:lineRule="atLeast"/>
+        <w:rPr>
+          <w:rFonts w:ascii="Consolas" w:eastAsia="Times New Roman" w:hAnsi="Consolas" w:cs="Times New Roman"/>
+          <w:color w:val="3B3B3B"/>
+          <w:kern w:val="0"/>
+          <w:sz w:val="21"/>
+          <w:szCs w:val="21"/>
+          <w14:ligatures w14:val="none"/>
+        </w:rPr>
+      </w:pPr>
+      <w:r>
+        <w:rPr>
+          <w:rFonts w:ascii="Consolas" w:eastAsia="Times New Roman" w:hAnsi="Consolas" w:cs="Times New Roman"/>
+          <w:color w:val="3B3B3B"/>
+          <w:kern w:val="0"/>
+          <w:sz w:val="21"/>
+          <w:szCs w:val="21"/>
+          <w14:ligatures w14:val="none"/>
+        </w:rPr>
+        <w:t xml:space="preserve">        </w:t>
+      </w:r>
+      <w:r>
+        <w:rPr>
+          <w:rFonts w:ascii="Consolas" w:eastAsia="Times New Roman" w:hAnsi="Consolas" w:cs="Times New Roman"/>
+          <w:color w:val="AF00DB"/>
+          <w:kern w:val="0"/>
+          <w:sz w:val="21"/>
+          <w:szCs w:val="21"/>
+          <w14:ligatures w14:val="none"/>
+        </w:rPr>
+        <w:t>@apply</w:t>
+      </w:r>
+      <w:r>
+        <w:rPr>
+          <w:rFonts w:ascii="Consolas" w:eastAsia="Times New Roman" w:hAnsi="Consolas" w:cs="Times New Roman"/>
+          <w:color w:val="3B3B3B"/>
+          <w:kern w:val="0"/>
+          <w:sz w:val="21"/>
+          <w:szCs w:val="21"/>
+          <w14:ligatures w14:val="none"/>
+        </w:rPr>
+        <w:t xml:space="preserve"> </w:t>
+      </w:r>
+      <w:r>
+        <w:rPr>
+          <w:rFonts w:ascii="Consolas" w:eastAsia="Times New Roman" w:hAnsi="Consolas" w:cs="Times New Roman"/>
+          <w:color w:val="800000"/>
+          <w:kern w:val="0"/>
+          <w:sz w:val="21"/>
+          <w:szCs w:val="21"/>
+          <w14:ligatures w14:val="none"/>
+        </w:rPr>
+        <w:t>leading-tight</w:t>
+      </w:r>
+      <w:r>
+        <w:rPr>
+          <w:rFonts w:ascii="Consolas" w:eastAsia="Times New Roman" w:hAnsi="Consolas" w:cs="Times New Roman"/>
+          <w:color w:val="3B3B3B"/>
+          <w:kern w:val="0"/>
+          <w:sz w:val="21"/>
+          <w:szCs w:val="21"/>
+          <w14:ligatures w14:val="none"/>
+        </w:rPr>
+        <w:t xml:space="preserve"> </w:t>
+      </w:r>
+      <w:r>
+        <w:rPr>
+          <w:rFonts w:ascii="Consolas" w:eastAsia="Times New Roman" w:hAnsi="Consolas" w:cs="Times New Roman"/>
+          <w:color w:val="800000"/>
+          <w:kern w:val="0"/>
+          <w:sz w:val="21"/>
+          <w:szCs w:val="21"/>
+          <w14:ligatures w14:val="none"/>
+        </w:rPr>
+        <w:t>text-sm</w:t>
+      </w:r>
+    </w:p>
+    <w:p>
+      <w:pPr>
+        <w:shd w:val="clear" w:color="auto" w:fill="FFFFFF"/>
+        <w:spacing w:after="0" w:line="285" w:lineRule="atLeast"/>
+        <w:rPr>
+          <w:rFonts w:ascii="Consolas" w:eastAsia="Times New Roman" w:hAnsi="Consolas" w:cs="Times New Roman"/>
+          <w:color w:val="3B3B3B"/>
+          <w:kern w:val="0"/>
+          <w:sz w:val="21"/>
+          <w:szCs w:val="21"/>
+          <w14:ligatures w14:val="none"/>
+        </w:rPr>
+      </w:pPr>
+      <w:r>
+        <w:rPr>
+          <w:rFonts w:ascii="Consolas" w:eastAsia="Times New Roman" w:hAnsi="Consolas" w:cs="Times New Roman"/>
+          <w:color w:val="3B3B3B"/>
+          <w:kern w:val="0"/>
+          <w:sz w:val="21"/>
+          <w:szCs w:val="21"/>
+          <w14:ligatures w14:val="none"/>
+        </w:rPr>
+        <w:t>    }</w:t>
+      </w:r>
+    </w:p>
+    <w:p>
+      <w:pPr>
+        <w:shd w:val="clear" w:color="auto" w:fill="FFFFFF"/>
+        <w:spacing w:after="0" w:line="285" w:lineRule="atLeast"/>
+        <w:rPr>
+          <w:rFonts w:ascii="Consolas" w:eastAsia="Times New Roman" w:hAnsi="Consolas" w:cs="Times New Roman"/>
+          <w:color w:val="3B3B3B"/>
+          <w:kern w:val="0"/>
+          <w:sz w:val="21"/>
+          <w:szCs w:val="21"/>
+          <w14:ligatures w14:val="none"/>
+        </w:rPr>
+      </w:pPr>
+    </w:p>
+    <w:p>
+      <w:pPr>
+        <w:shd w:val="clear" w:color="auto" w:fill="FFFFFF"/>
+        <w:spacing w:after="0" w:line="285" w:lineRule="atLeast"/>
+        <w:rPr>
+          <w:rFonts w:ascii="Consolas" w:eastAsia="Times New Roman" w:hAnsi="Consolas" w:cs="Times New Roman"/>
+          <w:color w:val="3B3B3B"/>
+          <w:kern w:val="0"/>
+          <w:sz w:val="21"/>
+          <w:szCs w:val="21"/>
+          <w14:ligatures w14:val="none"/>
+        </w:rPr>
+      </w:pPr>
+      <w:r>
+        <w:rPr>
+          <w:rFonts w:ascii="Consolas" w:eastAsia="Times New Roman" w:hAnsi="Consolas" w:cs="Times New Roman"/>
+          <w:color w:val="3B3B3B"/>
+          <w:kern w:val="0"/>
+          <w:sz w:val="21"/>
+          <w:szCs w:val="21"/>
+          <w14:ligatures w14:val="none"/>
+        </w:rPr>
+        <w:t xml:space="preserve">    </w:t>
+      </w:r>
+      <w:proofErr w:type="gramStart"/>
+      <w:r>
+        <w:rPr>
+          <w:rFonts w:ascii="Consolas" w:eastAsia="Times New Roman" w:hAnsi="Consolas" w:cs="Times New Roman"/>
+          <w:color w:val="800000"/>
+          <w:kern w:val="0"/>
+          <w:sz w:val="21"/>
+          <w:szCs w:val="21"/>
+          <w14:ligatures w14:val="none"/>
+        </w:rPr>
+        <w:t>.alert</w:t>
+      </w:r>
+      <w:proofErr w:type="gramEnd"/>
+      <w:r>
+        <w:rPr>
+          <w:rFonts w:ascii="Consolas" w:eastAsia="Times New Roman" w:hAnsi="Consolas" w:cs="Times New Roman"/>
+          <w:color w:val="800000"/>
+          <w:kern w:val="0"/>
+          <w:sz w:val="21"/>
+          <w:szCs w:val="21"/>
+          <w14:ligatures w14:val="none"/>
+        </w:rPr>
+        <w:t>-info</w:t>
+      </w:r>
+      <w:r>
+        <w:rPr>
+          <w:rFonts w:ascii="Consolas" w:eastAsia="Times New Roman" w:hAnsi="Consolas" w:cs="Times New Roman"/>
+          <w:color w:val="3B3B3B"/>
+          <w:kern w:val="0"/>
+          <w:sz w:val="21"/>
+          <w:szCs w:val="21"/>
+          <w14:ligatures w14:val="none"/>
+        </w:rPr>
+        <w:t xml:space="preserve"> {</w:t>
+      </w:r>
+    </w:p>
+    <w:p>
+      <w:pPr>
+        <w:shd w:val="clear" w:color="auto" w:fill="FFFFFF"/>
+        <w:spacing w:after="0" w:line="285" w:lineRule="atLeast"/>
+        <w:rPr>
+          <w:rFonts w:ascii="Consolas" w:eastAsia="Times New Roman" w:hAnsi="Consolas" w:cs="Times New Roman"/>
+          <w:color w:val="3B3B3B"/>
+          <w:kern w:val="0"/>
+          <w:sz w:val="21"/>
+          <w:szCs w:val="21"/>
+          <w14:ligatures w14:val="none"/>
+        </w:rPr>
+      </w:pPr>
+      <w:r>
+        <w:rPr>
+          <w:rFonts w:ascii="Consolas" w:eastAsia="Times New Roman" w:hAnsi="Consolas" w:cs="Times New Roman"/>
+          <w:color w:val="3B3B3B"/>
+          <w:kern w:val="0"/>
+          <w:sz w:val="21"/>
+          <w:szCs w:val="21"/>
+          <w14:ligatures w14:val="none"/>
+        </w:rPr>
+        <w:t xml:space="preserve">        </w:t>
+      </w:r>
+      <w:r>
+        <w:rPr>
+          <w:rFonts w:ascii="Consolas" w:eastAsia="Times New Roman" w:hAnsi="Consolas" w:cs="Times New Roman"/>
+          <w:color w:val="AF00DB"/>
+          <w:kern w:val="0"/>
+          <w:sz w:val="21"/>
+          <w:szCs w:val="21"/>
+          <w14:ligatures w14:val="none"/>
+        </w:rPr>
+        <w:t>@apply</w:t>
+      </w:r>
+      <w:r>
+        <w:rPr>
+          <w:rFonts w:ascii="Consolas" w:eastAsia="Times New Roman" w:hAnsi="Consolas" w:cs="Times New Roman"/>
+          <w:color w:val="3B3B3B"/>
+          <w:kern w:val="0"/>
+          <w:sz w:val="21"/>
+          <w:szCs w:val="21"/>
+          <w14:ligatures w14:val="none"/>
+        </w:rPr>
+        <w:t xml:space="preserve"> </w:t>
+      </w:r>
+      <w:r>
+        <w:rPr>
+          <w:rFonts w:ascii="Consolas" w:eastAsia="Times New Roman" w:hAnsi="Consolas" w:cs="Times New Roman"/>
+          <w:color w:val="800000"/>
+          <w:kern w:val="0"/>
+          <w:sz w:val="21"/>
+          <w:szCs w:val="21"/>
+          <w14:ligatures w14:val="none"/>
+        </w:rPr>
+        <w:t>bg-blue-100</w:t>
+      </w:r>
+      <w:r>
+        <w:rPr>
+          <w:rFonts w:ascii="Consolas" w:eastAsia="Times New Roman" w:hAnsi="Consolas" w:cs="Times New Roman"/>
+          <w:color w:val="3B3B3B"/>
+          <w:kern w:val="0"/>
+          <w:sz w:val="21"/>
+          <w:szCs w:val="21"/>
+          <w14:ligatures w14:val="none"/>
+        </w:rPr>
+        <w:t xml:space="preserve"> </w:t>
+      </w:r>
+      <w:r>
+        <w:rPr>
+          <w:rFonts w:ascii="Consolas" w:eastAsia="Times New Roman" w:hAnsi="Consolas" w:cs="Times New Roman"/>
+          <w:color w:val="800000"/>
+          <w:kern w:val="0"/>
+          <w:sz w:val="21"/>
+          <w:szCs w:val="21"/>
+          <w14:ligatures w14:val="none"/>
+        </w:rPr>
+        <w:t>border-blue-500</w:t>
+      </w:r>
+    </w:p>
+    <w:p>
+      <w:pPr>
+        <w:shd w:val="clear" w:color="auto" w:fill="FFFFFF"/>
+        <w:spacing w:after="0" w:line="285" w:lineRule="atLeast"/>
+        <w:rPr>
+          <w:rFonts w:ascii="Consolas" w:eastAsia="Times New Roman" w:hAnsi="Consolas" w:cs="Times New Roman"/>
+          <w:color w:val="3B3B3B"/>
+          <w:kern w:val="0"/>
+          <w:sz w:val="21"/>
+          <w:szCs w:val="21"/>
+          <w14:ligatures w14:val="none"/>
+        </w:rPr>
+      </w:pPr>
+      <w:r>
+        <w:rPr>
+          <w:rFonts w:ascii="Consolas" w:eastAsia="Times New Roman" w:hAnsi="Consolas" w:cs="Times New Roman"/>
+          <w:color w:val="3B3B3B"/>
+          <w:kern w:val="0"/>
+          <w:sz w:val="21"/>
+          <w:szCs w:val="21"/>
+          <w14:ligatures w14:val="none"/>
+        </w:rPr>
+        <w:t>    }</w:t>
+      </w:r>
+    </w:p>
+    <w:p>
+      <w:pPr>
+        <w:shd w:val="clear" w:color="auto" w:fill="FFFFFF"/>
+        <w:spacing w:after="0" w:line="285" w:lineRule="atLeast"/>
+        <w:rPr>
+          <w:rFonts w:ascii="Consolas" w:eastAsia="Times New Roman" w:hAnsi="Consolas" w:cs="Times New Roman"/>
+          <w:color w:val="3B3B3B"/>
+          <w:kern w:val="0"/>
+          <w:sz w:val="21"/>
+          <w:szCs w:val="21"/>
+          <w14:ligatures w14:val="none"/>
+        </w:rPr>
+      </w:pPr>
+    </w:p>
+    <w:p>
+      <w:pPr>
+        <w:shd w:val="clear" w:color="auto" w:fill="FFFFFF"/>
+        <w:spacing w:after="0" w:line="285" w:lineRule="atLeast"/>
+        <w:rPr>
+          <w:rFonts w:ascii="Consolas" w:eastAsia="Times New Roman" w:hAnsi="Consolas" w:cs="Times New Roman"/>
+          <w:color w:val="3B3B3B"/>
+          <w:kern w:val="0"/>
+          <w:sz w:val="21"/>
+          <w:szCs w:val="21"/>
+          <w14:ligatures w14:val="none"/>
+        </w:rPr>
+      </w:pPr>
+      <w:r>
+        <w:rPr>
+          <w:rFonts w:ascii="Consolas" w:eastAsia="Times New Roman" w:hAnsi="Consolas" w:cs="Times New Roman"/>
+          <w:color w:val="3B3B3B"/>
+          <w:kern w:val="0"/>
+          <w:sz w:val="21"/>
+          <w:szCs w:val="21"/>
+          <w14:ligatures w14:val="none"/>
+        </w:rPr>
+        <w:t xml:space="preserve">    </w:t>
+      </w:r>
+      <w:proofErr w:type="gramStart"/>
+      <w:r>
+        <w:rPr>
+          <w:rFonts w:ascii="Consolas" w:eastAsia="Times New Roman" w:hAnsi="Consolas" w:cs="Times New Roman"/>
+          <w:color w:val="800000"/>
+          <w:kern w:val="0"/>
+          <w:sz w:val="21"/>
+          <w:szCs w:val="21"/>
+          <w14:ligatures w14:val="none"/>
+        </w:rPr>
+        <w:t>.alert</w:t>
+      </w:r>
+      <w:proofErr w:type="gramEnd"/>
+      <w:r>
+        <w:rPr>
+          <w:rFonts w:ascii="Consolas" w:eastAsia="Times New Roman" w:hAnsi="Consolas" w:cs="Times New Roman"/>
+          <w:color w:val="800000"/>
+          <w:kern w:val="0"/>
+          <w:sz w:val="21"/>
+          <w:szCs w:val="21"/>
+          <w14:ligatures w14:val="none"/>
+        </w:rPr>
+        <w:t>-info-title</w:t>
+      </w:r>
+      <w:r>
+        <w:rPr>
+          <w:rFonts w:ascii="Consolas" w:eastAsia="Times New Roman" w:hAnsi="Consolas" w:cs="Times New Roman"/>
+          <w:color w:val="3B3B3B"/>
+          <w:kern w:val="0"/>
+          <w:sz w:val="21"/>
+          <w:szCs w:val="21"/>
+          <w14:ligatures w14:val="none"/>
+        </w:rPr>
+        <w:t xml:space="preserve"> {</w:t>
+      </w:r>
+    </w:p>
+    <w:p>
+      <w:pPr>
+        <w:shd w:val="clear" w:color="auto" w:fill="FFFFFF"/>
+        <w:spacing w:after="0" w:line="285" w:lineRule="atLeast"/>
+        <w:rPr>
+          <w:rFonts w:ascii="Consolas" w:eastAsia="Times New Roman" w:hAnsi="Consolas" w:cs="Times New Roman"/>
+          <w:color w:val="3B3B3B"/>
+          <w:kern w:val="0"/>
+          <w:sz w:val="21"/>
+          <w:szCs w:val="21"/>
+          <w14:ligatures w14:val="none"/>
+        </w:rPr>
+      </w:pPr>
+      <w:r>
+        <w:rPr>
+          <w:rFonts w:ascii="Consolas" w:eastAsia="Times New Roman" w:hAnsi="Consolas" w:cs="Times New Roman"/>
+          <w:color w:val="3B3B3B"/>
+          <w:kern w:val="0"/>
+          <w:sz w:val="21"/>
+          <w:szCs w:val="21"/>
+          <w14:ligatures w14:val="none"/>
+        </w:rPr>
+        <w:t xml:space="preserve">        </w:t>
+      </w:r>
+      <w:r>
+        <w:rPr>
+          <w:rFonts w:ascii="Consolas" w:eastAsia="Times New Roman" w:hAnsi="Consolas" w:cs="Times New Roman"/>
+          <w:color w:val="AF00DB"/>
+          <w:kern w:val="0"/>
+          <w:sz w:val="21"/>
+          <w:szCs w:val="21"/>
+          <w14:ligatures w14:val="none"/>
+        </w:rPr>
+        <w:t>@apply</w:t>
+      </w:r>
+      <w:r>
+        <w:rPr>
+          <w:rFonts w:ascii="Consolas" w:eastAsia="Times New Roman" w:hAnsi="Consolas" w:cs="Times New Roman"/>
+          <w:color w:val="3B3B3B"/>
+          <w:kern w:val="0"/>
+          <w:sz w:val="21"/>
+          <w:szCs w:val="21"/>
+          <w14:ligatures w14:val="none"/>
+        </w:rPr>
+        <w:t xml:space="preserve"> </w:t>
+      </w:r>
+      <w:r>
+        <w:rPr>
+          <w:rFonts w:ascii="Consolas" w:eastAsia="Times New Roman" w:hAnsi="Consolas" w:cs="Times New Roman"/>
+          <w:color w:val="800000"/>
+          <w:kern w:val="0"/>
+          <w:sz w:val="21"/>
+          <w:szCs w:val="21"/>
+          <w14:ligatures w14:val="none"/>
+        </w:rPr>
+        <w:t>text-blue-500</w:t>
+      </w:r>
+    </w:p>
+    <w:p>
+      <w:pPr>
+        <w:shd w:val="clear" w:color="auto" w:fill="FFFFFF"/>
+        <w:spacing w:after="0" w:line="285" w:lineRule="atLeast"/>
+        <w:rPr>
+          <w:rFonts w:ascii="Consolas" w:eastAsia="Times New Roman" w:hAnsi="Consolas" w:cs="Times New Roman"/>
+          <w:color w:val="3B3B3B"/>
+          <w:kern w:val="0"/>
+          <w:sz w:val="21"/>
+          <w:szCs w:val="21"/>
+          <w14:ligatures w14:val="none"/>
+        </w:rPr>
+      </w:pPr>
+      <w:r>
+        <w:rPr>
+          <w:rFonts w:ascii="Consolas" w:eastAsia="Times New Roman" w:hAnsi="Consolas" w:cs="Times New Roman"/>
+          <w:color w:val="3B3B3B"/>
+          <w:kern w:val="0"/>
+          <w:sz w:val="21"/>
+          <w:szCs w:val="21"/>
+          <w14:ligatures w14:val="none"/>
+        </w:rPr>
+        <w:t>    }</w:t>
+      </w:r>
+    </w:p>
+    <w:p>
+      <w:pPr>
+        <w:shd w:val="clear" w:color="auto" w:fill="FFFFFF"/>
+        <w:spacing w:after="0" w:line="285" w:lineRule="atLeast"/>
+        <w:rPr>
+          <w:rFonts w:ascii="Consolas" w:eastAsia="Times New Roman" w:hAnsi="Consolas" w:cs="Times New Roman"/>
+          <w:color w:val="3B3B3B"/>
+          <w:kern w:val="0"/>
+          <w:sz w:val="21"/>
+          <w:szCs w:val="21"/>
+          <w14:ligatures w14:val="none"/>
+        </w:rPr>
+      </w:pPr>
+    </w:p>
+    <w:p>
+      <w:pPr>
+        <w:shd w:val="clear" w:color="auto" w:fill="FFFFFF"/>
+        <w:spacing w:after="0" w:line="285" w:lineRule="atLeast"/>
+        <w:rPr>
+          <w:rFonts w:ascii="Consolas" w:eastAsia="Times New Roman" w:hAnsi="Consolas" w:cs="Times New Roman"/>
+          <w:color w:val="3B3B3B"/>
+          <w:kern w:val="0"/>
+          <w:sz w:val="21"/>
+          <w:szCs w:val="21"/>
+          <w14:ligatures w14:val="none"/>
+        </w:rPr>
+      </w:pPr>
+      <w:r>
+        <w:rPr>
+          <w:rFonts w:ascii="Consolas" w:eastAsia="Times New Roman" w:hAnsi="Consolas" w:cs="Times New Roman"/>
+          <w:color w:val="3B3B3B"/>
+          <w:kern w:val="0"/>
+          <w:sz w:val="21"/>
+          <w:szCs w:val="21"/>
+          <w14:ligatures w14:val="none"/>
+        </w:rPr>
+        <w:t xml:space="preserve">    </w:t>
+      </w:r>
+      <w:proofErr w:type="gramStart"/>
+      <w:r>
+        <w:rPr>
+          <w:rFonts w:ascii="Consolas" w:eastAsia="Times New Roman" w:hAnsi="Consolas" w:cs="Times New Roman"/>
+          <w:color w:val="800000"/>
+          <w:kern w:val="0"/>
+          <w:sz w:val="21"/>
+          <w:szCs w:val="21"/>
+          <w14:ligatures w14:val="none"/>
+        </w:rPr>
+        <w:t>.alert</w:t>
+      </w:r>
+      <w:proofErr w:type="gramEnd"/>
+      <w:r>
+        <w:rPr>
+          <w:rFonts w:ascii="Consolas" w:eastAsia="Times New Roman" w:hAnsi="Consolas" w:cs="Times New Roman"/>
+          <w:color w:val="800000"/>
+          <w:kern w:val="0"/>
+          <w:sz w:val="21"/>
+          <w:szCs w:val="21"/>
+          <w14:ligatures w14:val="none"/>
+        </w:rPr>
+        <w:t>-info-content</w:t>
+      </w:r>
+      <w:r>
+        <w:rPr>
+          <w:rFonts w:ascii="Consolas" w:eastAsia="Times New Roman" w:hAnsi="Consolas" w:cs="Times New Roman"/>
+          <w:color w:val="3B3B3B"/>
+          <w:kern w:val="0"/>
+          <w:sz w:val="21"/>
+          <w:szCs w:val="21"/>
+          <w14:ligatures w14:val="none"/>
+        </w:rPr>
+        <w:t xml:space="preserve"> {</w:t>
+      </w:r>
+    </w:p>
+    <w:p>
+      <w:pPr>
+        <w:shd w:val="clear" w:color="auto" w:fill="FFFFFF"/>
+        <w:spacing w:after="0" w:line="285" w:lineRule="atLeast"/>
+        <w:rPr>
+          <w:rFonts w:ascii="Consolas" w:eastAsia="Times New Roman" w:hAnsi="Consolas" w:cs="Times New Roman"/>
+          <w:color w:val="3B3B3B"/>
+          <w:kern w:val="0"/>
+          <w:sz w:val="21"/>
+          <w:szCs w:val="21"/>
+          <w14:ligatures w14:val="none"/>
+        </w:rPr>
+      </w:pPr>
+      <w:r>
+        <w:rPr>
+          <w:rFonts w:ascii="Consolas" w:eastAsia="Times New Roman" w:hAnsi="Consolas" w:cs="Times New Roman"/>
+          <w:color w:val="3B3B3B"/>
+          <w:kern w:val="0"/>
+          <w:sz w:val="21"/>
+          <w:szCs w:val="21"/>
+          <w14:ligatures w14:val="none"/>
+        </w:rPr>
+        <w:t xml:space="preserve">        </w:t>
+      </w:r>
+      <w:r>
+        <w:rPr>
+          <w:rFonts w:ascii="Consolas" w:eastAsia="Times New Roman" w:hAnsi="Consolas" w:cs="Times New Roman"/>
+          <w:color w:val="AF00DB"/>
+          <w:kern w:val="0"/>
+          <w:sz w:val="21"/>
+          <w:szCs w:val="21"/>
+          <w14:ligatures w14:val="none"/>
+        </w:rPr>
+        <w:t>@apply</w:t>
+      </w:r>
+      <w:r>
+        <w:rPr>
+          <w:rFonts w:ascii="Consolas" w:eastAsia="Times New Roman" w:hAnsi="Consolas" w:cs="Times New Roman"/>
+          <w:color w:val="3B3B3B"/>
+          <w:kern w:val="0"/>
+          <w:sz w:val="21"/>
+          <w:szCs w:val="21"/>
+          <w14:ligatures w14:val="none"/>
+        </w:rPr>
+        <w:t xml:space="preserve"> </w:t>
+      </w:r>
+      <w:r>
+        <w:rPr>
+          <w:rFonts w:ascii="Consolas" w:eastAsia="Times New Roman" w:hAnsi="Consolas" w:cs="Times New Roman"/>
+          <w:color w:val="800000"/>
+          <w:kern w:val="0"/>
+          <w:sz w:val="21"/>
+          <w:szCs w:val="21"/>
+          <w14:ligatures w14:val="none"/>
+        </w:rPr>
+        <w:t>text-blue-800</w:t>
+      </w:r>
+    </w:p>
+    <w:p>
+      <w:pPr>
+        <w:shd w:val="clear" w:color="auto" w:fill="FFFFFF"/>
+        <w:spacing w:after="0" w:line="285" w:lineRule="atLeast"/>
+        <w:rPr>
+          <w:rFonts w:ascii="Consolas" w:eastAsia="Times New Roman" w:hAnsi="Consolas" w:cs="Times New Roman"/>
+          <w:color w:val="3B3B3B"/>
+          <w:kern w:val="0"/>
+          <w:sz w:val="21"/>
+          <w:szCs w:val="21"/>
+          <w14:ligatures w14:val="none"/>
+        </w:rPr>
+      </w:pPr>
+      <w:r>
+        <w:rPr>
+          <w:rFonts w:ascii="Consolas" w:eastAsia="Times New Roman" w:hAnsi="Consolas" w:cs="Times New Roman"/>
+          <w:color w:val="3B3B3B"/>
+          <w:kern w:val="0"/>
+          <w:sz w:val="21"/>
+          <w:szCs w:val="21"/>
+          <w14:ligatures w14:val="none"/>
+        </w:rPr>
+        <w:t>    }</w:t>
+      </w:r>
+    </w:p>
+    <w:p>
+      <w:pPr>
+        <w:shd w:val="clear" w:color="auto" w:fill="FFFFFF"/>
+        <w:spacing w:after="0" w:line="285" w:lineRule="atLeast"/>
+        <w:rPr>
+          <w:rFonts w:ascii="Consolas" w:eastAsia="Times New Roman" w:hAnsi="Consolas" w:cs="Times New Roman"/>
+          <w:color w:val="3B3B3B"/>
+          <w:kern w:val="0"/>
+          <w:sz w:val="21"/>
+          <w:szCs w:val="21"/>
+          <w14:ligatures w14:val="none"/>
+        </w:rPr>
+      </w:pPr>
+    </w:p>
+    <w:p>
+      <w:pPr>
+        <w:shd w:val="clear" w:color="auto" w:fill="FFFFFF"/>
+        <w:spacing w:after="0" w:line="285" w:lineRule="atLeast"/>
+        <w:rPr>
+          <w:rFonts w:ascii="Consolas" w:eastAsia="Times New Roman" w:hAnsi="Consolas" w:cs="Times New Roman"/>
+          <w:color w:val="3B3B3B"/>
+          <w:kern w:val="0"/>
+          <w:sz w:val="21"/>
+          <w:szCs w:val="21"/>
+          <w14:ligatures w14:val="none"/>
+        </w:rPr>
+      </w:pPr>
+      <w:r>
+        <w:rPr>
+          <w:rFonts w:ascii="Consolas" w:eastAsia="Times New Roman" w:hAnsi="Consolas" w:cs="Times New Roman"/>
+          <w:color w:val="3B3B3B"/>
+          <w:kern w:val="0"/>
+          <w:sz w:val="21"/>
+          <w:szCs w:val="21"/>
+          <w14:ligatures w14:val="none"/>
+        </w:rPr>
+        <w:t xml:space="preserve">    </w:t>
+      </w:r>
+      <w:proofErr w:type="gramStart"/>
+      <w:r>
+        <w:rPr>
+          <w:rFonts w:ascii="Consolas" w:eastAsia="Times New Roman" w:hAnsi="Consolas" w:cs="Times New Roman"/>
+          <w:color w:val="800000"/>
+          <w:kern w:val="0"/>
+          <w:sz w:val="21"/>
+          <w:szCs w:val="21"/>
+          <w14:ligatures w14:val="none"/>
+        </w:rPr>
+        <w:t>.alert</w:t>
+      </w:r>
+      <w:proofErr w:type="gramEnd"/>
+      <w:r>
+        <w:rPr>
+          <w:rFonts w:ascii="Consolas" w:eastAsia="Times New Roman" w:hAnsi="Consolas" w:cs="Times New Roman"/>
+          <w:color w:val="800000"/>
+          <w:kern w:val="0"/>
+          <w:sz w:val="21"/>
+          <w:szCs w:val="21"/>
+          <w14:ligatures w14:val="none"/>
+        </w:rPr>
+        <w:t>-warning</w:t>
+      </w:r>
+      <w:r>
+        <w:rPr>
+          <w:rFonts w:ascii="Consolas" w:eastAsia="Times New Roman" w:hAnsi="Consolas" w:cs="Times New Roman"/>
+          <w:color w:val="3B3B3B"/>
+          <w:kern w:val="0"/>
+          <w:sz w:val="21"/>
+          <w:szCs w:val="21"/>
+          <w14:ligatures w14:val="none"/>
+        </w:rPr>
+        <w:t xml:space="preserve"> {</w:t>
+      </w:r>
+    </w:p>
+    <w:p>
+      <w:pPr>
+        <w:shd w:val="clear" w:color="auto" w:fill="FFFFFF"/>
+        <w:spacing w:after="0" w:line="285" w:lineRule="atLeast"/>
+        <w:rPr>
+          <w:rFonts w:ascii="Consolas" w:eastAsia="Times New Roman" w:hAnsi="Consolas" w:cs="Times New Roman"/>
+          <w:color w:val="3B3B3B"/>
+          <w:kern w:val="0"/>
+          <w:sz w:val="21"/>
+          <w:szCs w:val="21"/>
+          <w14:ligatures w14:val="none"/>
+        </w:rPr>
+      </w:pPr>
+      <w:r>
+        <w:rPr>
+          <w:rFonts w:ascii="Consolas" w:eastAsia="Times New Roman" w:hAnsi="Consolas" w:cs="Times New Roman"/>
+          <w:color w:val="3B3B3B"/>
+          <w:kern w:val="0"/>
+          <w:sz w:val="21"/>
+          <w:szCs w:val="21"/>
+          <w14:ligatures w14:val="none"/>
+        </w:rPr>
+        <w:t xml:space="preserve">        </w:t>
+      </w:r>
+      <w:r>
+        <w:rPr>
+          <w:rFonts w:ascii="Consolas" w:eastAsia="Times New Roman" w:hAnsi="Consolas" w:cs="Times New Roman"/>
+          <w:color w:val="AF00DB"/>
+          <w:kern w:val="0"/>
+          <w:sz w:val="21"/>
+          <w:szCs w:val="21"/>
+          <w14:ligatures w14:val="none"/>
+        </w:rPr>
+        <w:t>@apply</w:t>
+      </w:r>
+      <w:r>
+        <w:rPr>
+          <w:rFonts w:ascii="Consolas" w:eastAsia="Times New Roman" w:hAnsi="Consolas" w:cs="Times New Roman"/>
+          <w:color w:val="3B3B3B"/>
+          <w:kern w:val="0"/>
+          <w:sz w:val="21"/>
+          <w:szCs w:val="21"/>
+          <w14:ligatures w14:val="none"/>
+        </w:rPr>
+        <w:t xml:space="preserve"> </w:t>
+      </w:r>
+      <w:r>
+        <w:rPr>
+          <w:rFonts w:ascii="Consolas" w:eastAsia="Times New Roman" w:hAnsi="Consolas" w:cs="Times New Roman"/>
+          <w:color w:val="800000"/>
+          <w:kern w:val="0"/>
+          <w:sz w:val="21"/>
+          <w:szCs w:val="21"/>
+          <w14:ligatures w14:val="none"/>
+        </w:rPr>
+        <w:t>bg-red-100</w:t>
+      </w:r>
+      <w:r>
+        <w:rPr>
+          <w:rFonts w:ascii="Consolas" w:eastAsia="Times New Roman" w:hAnsi="Consolas" w:cs="Times New Roman"/>
+          <w:color w:val="3B3B3B"/>
+          <w:kern w:val="0"/>
+          <w:sz w:val="21"/>
+          <w:szCs w:val="21"/>
+          <w14:ligatures w14:val="none"/>
+        </w:rPr>
+        <w:t xml:space="preserve"> </w:t>
+      </w:r>
+      <w:r>
+        <w:rPr>
+          <w:rFonts w:ascii="Consolas" w:eastAsia="Times New Roman" w:hAnsi="Consolas" w:cs="Times New Roman"/>
+          <w:color w:val="800000"/>
+          <w:kern w:val="0"/>
+          <w:sz w:val="21"/>
+          <w:szCs w:val="21"/>
+          <w14:ligatures w14:val="none"/>
+        </w:rPr>
+        <w:t>border-red-500</w:t>
+      </w:r>
+    </w:p>
+    <w:p>
+      <w:pPr>
+        <w:shd w:val="clear" w:color="auto" w:fill="FFFFFF"/>
+        <w:spacing w:after="0" w:line="285" w:lineRule="atLeast"/>
+        <w:rPr>
+          <w:rFonts w:ascii="Consolas" w:eastAsia="Times New Roman" w:hAnsi="Consolas" w:cs="Times New Roman"/>
+          <w:color w:val="3B3B3B"/>
+          <w:kern w:val="0"/>
+          <w:sz w:val="21"/>
+          <w:szCs w:val="21"/>
+          <w14:ligatures w14:val="none"/>
+        </w:rPr>
+      </w:pPr>
+      <w:r>
+        <w:rPr>
+          <w:rFonts w:ascii="Consolas" w:eastAsia="Times New Roman" w:hAnsi="Consolas" w:cs="Times New Roman"/>
+          <w:color w:val="3B3B3B"/>
+          <w:kern w:val="0"/>
+          <w:sz w:val="21"/>
+          <w:szCs w:val="21"/>
+          <w14:ligatures w14:val="none"/>
+        </w:rPr>
+        <w:t>    }</w:t>
+      </w:r>
+    </w:p>
+    <w:p>
+      <w:pPr>
+        <w:shd w:val="clear" w:color="auto" w:fill="FFFFFF"/>
+        <w:spacing w:after="0" w:line="285" w:lineRule="atLeast"/>
+        <w:rPr>
+          <w:rFonts w:ascii="Consolas" w:eastAsia="Times New Roman" w:hAnsi="Consolas" w:cs="Times New Roman"/>
+          <w:color w:val="3B3B3B"/>
+          <w:kern w:val="0"/>
+          <w:sz w:val="21"/>
+          <w:szCs w:val="21"/>
+          <w14:ligatures w14:val="none"/>
+        </w:rPr>
+      </w:pPr>
+    </w:p>
+    <w:p>
+      <w:pPr>
+        <w:shd w:val="clear" w:color="auto" w:fill="FFFFFF"/>
+        <w:spacing w:after="0" w:line="285" w:lineRule="atLeast"/>
+        <w:rPr>
+          <w:rFonts w:ascii="Consolas" w:eastAsia="Times New Roman" w:hAnsi="Consolas" w:cs="Times New Roman"/>
+          <w:color w:val="3B3B3B"/>
+          <w:kern w:val="0"/>
+          <w:sz w:val="21"/>
+          <w:szCs w:val="21"/>
+          <w14:ligatures w14:val="none"/>
+        </w:rPr>
+      </w:pPr>
+      <w:r>
+        <w:rPr>
+          <w:rFonts w:ascii="Consolas" w:eastAsia="Times New Roman" w:hAnsi="Consolas" w:cs="Times New Roman"/>
+          <w:color w:val="3B3B3B"/>
+          <w:kern w:val="0"/>
+          <w:sz w:val="21"/>
+          <w:szCs w:val="21"/>
+          <w14:ligatures w14:val="none"/>
+        </w:rPr>
+        <w:t xml:space="preserve">    </w:t>
+      </w:r>
+      <w:proofErr w:type="gramStart"/>
+      <w:r>
+        <w:rPr>
+          <w:rFonts w:ascii="Consolas" w:eastAsia="Times New Roman" w:hAnsi="Consolas" w:cs="Times New Roman"/>
+          <w:color w:val="800000"/>
+          <w:kern w:val="0"/>
+          <w:sz w:val="21"/>
+          <w:szCs w:val="21"/>
+          <w14:ligatures w14:val="none"/>
+        </w:rPr>
+        <w:t>.alert</w:t>
+      </w:r>
+      <w:proofErr w:type="gramEnd"/>
+      <w:r>
+        <w:rPr>
+          <w:rFonts w:ascii="Consolas" w:eastAsia="Times New Roman" w:hAnsi="Consolas" w:cs="Times New Roman"/>
+          <w:color w:val="800000"/>
+          <w:kern w:val="0"/>
+          <w:sz w:val="21"/>
+          <w:szCs w:val="21"/>
+          <w14:ligatures w14:val="none"/>
+        </w:rPr>
+        <w:t>-warning-title</w:t>
+      </w:r>
+      <w:r>
+        <w:rPr>
+          <w:rFonts w:ascii="Consolas" w:eastAsia="Times New Roman" w:hAnsi="Consolas" w:cs="Times New Roman"/>
+          <w:color w:val="3B3B3B"/>
+          <w:kern w:val="0"/>
+          <w:sz w:val="21"/>
+          <w:szCs w:val="21"/>
+          <w14:ligatures w14:val="none"/>
+        </w:rPr>
+        <w:t xml:space="preserve"> {</w:t>
+      </w:r>
+    </w:p>
+    <w:p>
+      <w:pPr>
+        <w:shd w:val="clear" w:color="auto" w:fill="FFFFFF"/>
+        <w:spacing w:after="0" w:line="285" w:lineRule="atLeast"/>
+        <w:rPr>
+          <w:rFonts w:ascii="Consolas" w:eastAsia="Times New Roman" w:hAnsi="Consolas" w:cs="Times New Roman"/>
+          <w:color w:val="3B3B3B"/>
+          <w:kern w:val="0"/>
+          <w:sz w:val="21"/>
+          <w:szCs w:val="21"/>
+          <w14:ligatures w14:val="none"/>
+        </w:rPr>
+      </w:pPr>
+      <w:r>
+        <w:rPr>
+          <w:rFonts w:ascii="Consolas" w:eastAsia="Times New Roman" w:hAnsi="Consolas" w:cs="Times New Roman"/>
+          <w:color w:val="3B3B3B"/>
+          <w:kern w:val="0"/>
+          <w:sz w:val="21"/>
+          <w:szCs w:val="21"/>
+          <w14:ligatures w14:val="none"/>
+        </w:rPr>
+        <w:t xml:space="preserve">        </w:t>
+      </w:r>
+      <w:r>
+        <w:rPr>
+          <w:rFonts w:ascii="Consolas" w:eastAsia="Times New Roman" w:hAnsi="Consolas" w:cs="Times New Roman"/>
+          <w:color w:val="AF00DB"/>
+          <w:kern w:val="0"/>
+          <w:sz w:val="21"/>
+          <w:szCs w:val="21"/>
+          <w14:ligatures w14:val="none"/>
+        </w:rPr>
+        <w:t>@apply</w:t>
+      </w:r>
+      <w:r>
+        <w:rPr>
+          <w:rFonts w:ascii="Consolas" w:eastAsia="Times New Roman" w:hAnsi="Consolas" w:cs="Times New Roman"/>
+          <w:color w:val="3B3B3B"/>
+          <w:kern w:val="0"/>
+          <w:sz w:val="21"/>
+          <w:szCs w:val="21"/>
+          <w14:ligatures w14:val="none"/>
+        </w:rPr>
+        <w:t xml:space="preserve"> </w:t>
+      </w:r>
+      <w:r>
+        <w:rPr>
+          <w:rFonts w:ascii="Consolas" w:eastAsia="Times New Roman" w:hAnsi="Consolas" w:cs="Times New Roman"/>
+          <w:color w:val="800000"/>
+          <w:kern w:val="0"/>
+          <w:sz w:val="21"/>
+          <w:szCs w:val="21"/>
+          <w14:ligatures w14:val="none"/>
+        </w:rPr>
+        <w:t>text-red-500</w:t>
+      </w:r>
+    </w:p>
+    <w:p>
+      <w:pPr>
+        <w:shd w:val="clear" w:color="auto" w:fill="FFFFFF"/>
+        <w:spacing w:after="0" w:line="285" w:lineRule="atLeast"/>
+        <w:rPr>
+          <w:rFonts w:ascii="Consolas" w:eastAsia="Times New Roman" w:hAnsi="Consolas" w:cs="Times New Roman"/>
+          <w:color w:val="3B3B3B"/>
+          <w:kern w:val="0"/>
+          <w:sz w:val="21"/>
+          <w:szCs w:val="21"/>
+          <w14:ligatures w14:val="none"/>
+        </w:rPr>
+      </w:pPr>
+      <w:r>
+        <w:rPr>
+          <w:rFonts w:ascii="Consolas" w:eastAsia="Times New Roman" w:hAnsi="Consolas" w:cs="Times New Roman"/>
+          <w:color w:val="3B3B3B"/>
+          <w:kern w:val="0"/>
+          <w:sz w:val="21"/>
+          <w:szCs w:val="21"/>
+          <w14:ligatures w14:val="none"/>
+        </w:rPr>
+        <w:t>    }</w:t>
+      </w:r>
+    </w:p>
+    <w:p>
+      <w:pPr>
+        <w:shd w:val="clear" w:color="auto" w:fill="FFFFFF"/>
+        <w:spacing w:after="0" w:line="285" w:lineRule="atLeast"/>
+        <w:rPr>
+          <w:rFonts w:ascii="Consolas" w:eastAsia="Times New Roman" w:hAnsi="Consolas" w:cs="Times New Roman"/>
+          <w:color w:val="3B3B3B"/>
+          <w:kern w:val="0"/>
+          <w:sz w:val="21"/>
+          <w:szCs w:val="21"/>
+          <w14:ligatures w14:val="none"/>
+        </w:rPr>
+      </w:pPr>
+    </w:p>
+    <w:p>
+      <w:pPr>
+        <w:shd w:val="clear" w:color="auto" w:fill="FFFFFF"/>
+        <w:spacing w:after="0" w:line="285" w:lineRule="atLeast"/>
+        <w:rPr>
+          <w:rFonts w:ascii="Consolas" w:eastAsia="Times New Roman" w:hAnsi="Consolas" w:cs="Times New Roman"/>
+          <w:color w:val="3B3B3B"/>
+          <w:kern w:val="0"/>
+          <w:sz w:val="21"/>
+          <w:szCs w:val="21"/>
+          <w14:ligatures w14:val="none"/>
+        </w:rPr>
+      </w:pPr>
+      <w:r>
+        <w:rPr>
+          <w:rFonts w:ascii="Consolas" w:eastAsia="Times New Roman" w:hAnsi="Consolas" w:cs="Times New Roman"/>
+          <w:color w:val="3B3B3B"/>
+          <w:kern w:val="0"/>
+          <w:sz w:val="21"/>
+          <w:szCs w:val="21"/>
+          <w14:ligatures w14:val="none"/>
+        </w:rPr>
+        <w:t xml:space="preserve">    </w:t>
+      </w:r>
+      <w:proofErr w:type="gramStart"/>
+      <w:r>
+        <w:rPr>
+          <w:rFonts w:ascii="Consolas" w:eastAsia="Times New Roman" w:hAnsi="Consolas" w:cs="Times New Roman"/>
+          <w:color w:val="800000"/>
+          <w:kern w:val="0"/>
+          <w:sz w:val="21"/>
+          <w:szCs w:val="21"/>
+          <w14:ligatures w14:val="none"/>
+        </w:rPr>
+        <w:t>.alert</w:t>
+      </w:r>
+      <w:proofErr w:type="gramEnd"/>
+      <w:r>
+        <w:rPr>
+          <w:rFonts w:ascii="Consolas" w:eastAsia="Times New Roman" w:hAnsi="Consolas" w:cs="Times New Roman"/>
+          <w:color w:val="800000"/>
+          <w:kern w:val="0"/>
+          <w:sz w:val="21"/>
+          <w:szCs w:val="21"/>
+          <w14:ligatures w14:val="none"/>
+        </w:rPr>
+        <w:t>-warning-content</w:t>
+      </w:r>
+      <w:r>
+        <w:rPr>
+          <w:rFonts w:ascii="Consolas" w:eastAsia="Times New Roman" w:hAnsi="Consolas" w:cs="Times New Roman"/>
+          <w:color w:val="3B3B3B"/>
+          <w:kern w:val="0"/>
+          <w:sz w:val="21"/>
+          <w:szCs w:val="21"/>
+          <w14:ligatures w14:val="none"/>
+        </w:rPr>
+        <w:t xml:space="preserve"> {</w:t>
+      </w:r>
+    </w:p>
+    <w:p>
+      <w:pPr>
+        <w:shd w:val="clear" w:color="auto" w:fill="FFFFFF"/>
+        <w:spacing w:after="0" w:line="285" w:lineRule="atLeast"/>
+        <w:rPr>
+          <w:rFonts w:ascii="Consolas" w:eastAsia="Times New Roman" w:hAnsi="Consolas" w:cs="Times New Roman"/>
+          <w:color w:val="3B3B3B"/>
+          <w:kern w:val="0"/>
+          <w:sz w:val="21"/>
+          <w:szCs w:val="21"/>
+          <w14:ligatures w14:val="none"/>
+        </w:rPr>
+      </w:pPr>
+      <w:r>
+        <w:rPr>
+          <w:rFonts w:ascii="Consolas" w:eastAsia="Times New Roman" w:hAnsi="Consolas" w:cs="Times New Roman"/>
+          <w:color w:val="3B3B3B"/>
+          <w:kern w:val="0"/>
+          <w:sz w:val="21"/>
+          <w:szCs w:val="21"/>
+          <w14:ligatures w14:val="none"/>
+        </w:rPr>
+        <w:t xml:space="preserve">        </w:t>
+      </w:r>
+      <w:r>
+        <w:rPr>
+          <w:rFonts w:ascii="Consolas" w:eastAsia="Times New Roman" w:hAnsi="Consolas" w:cs="Times New Roman"/>
+          <w:color w:val="AF00DB"/>
+          <w:kern w:val="0"/>
+          <w:sz w:val="21"/>
+          <w:szCs w:val="21"/>
+          <w14:ligatures w14:val="none"/>
+        </w:rPr>
+        <w:t>@apply</w:t>
+      </w:r>
+      <w:r>
+        <w:rPr>
+          <w:rFonts w:ascii="Consolas" w:eastAsia="Times New Roman" w:hAnsi="Consolas" w:cs="Times New Roman"/>
+          <w:color w:val="3B3B3B"/>
+          <w:kern w:val="0"/>
+          <w:sz w:val="21"/>
+          <w:szCs w:val="21"/>
+          <w14:ligatures w14:val="none"/>
+        </w:rPr>
+        <w:t xml:space="preserve"> </w:t>
+      </w:r>
+      <w:r>
+        <w:rPr>
+          <w:rFonts w:ascii="Consolas" w:eastAsia="Times New Roman" w:hAnsi="Consolas" w:cs="Times New Roman"/>
+          <w:color w:val="800000"/>
+          <w:kern w:val="0"/>
+          <w:sz w:val="21"/>
+          <w:szCs w:val="21"/>
+          <w14:ligatures w14:val="none"/>
+        </w:rPr>
+        <w:t>text-red-800</w:t>
+      </w:r>
+    </w:p>
+    <w:p>
+      <w:pPr>
+        <w:shd w:val="clear" w:color="auto" w:fill="FFFFFF"/>
+        <w:spacing w:after="0" w:line="285" w:lineRule="atLeast"/>
+        <w:rPr>
+          <w:rFonts w:ascii="Consolas" w:eastAsia="Times New Roman" w:hAnsi="Consolas" w:cs="Times New Roman"/>
+          <w:color w:val="3B3B3B"/>
+          <w:kern w:val="0"/>
+          <w:sz w:val="21"/>
+          <w:szCs w:val="21"/>
+          <w14:ligatures w14:val="none"/>
+        </w:rPr>
+      </w:pPr>
+      <w:r>
+        <w:rPr>
+          <w:rFonts w:ascii="Consolas" w:eastAsia="Times New Roman" w:hAnsi="Consolas" w:cs="Times New Roman"/>
+          <w:color w:val="3B3B3B"/>
+          <w:kern w:val="0"/>
+          <w:sz w:val="21"/>
+          <w:szCs w:val="21"/>
+          <w14:ligatures w14:val="none"/>
+        </w:rPr>
+        <w:t>    }</w:t>
+      </w:r>
+    </w:p>
+    <w:p>
+      <w:pPr>
+        <w:shd w:val="clear" w:color="auto" w:fill="FFFFFF"/>
+        <w:spacing w:after="0" w:line="285" w:lineRule="atLeast"/>
+        <w:rPr>
+          <w:rFonts w:ascii="Consolas" w:eastAsia="Times New Roman" w:hAnsi="Consolas" w:cs="Times New Roman"/>
+          <w:color w:val="3B3B3B"/>
+          <w:kern w:val="0"/>
+          <w:sz w:val="21"/>
+          <w:szCs w:val="21"/>
+          <w14:ligatures w14:val="none"/>
+        </w:rPr>
+      </w:pPr>
+      <w:r>
+        <w:rPr>
+          <w:rFonts w:ascii="Consolas" w:eastAsia="Times New Roman" w:hAnsi="Consolas" w:cs="Times New Roman"/>
+          <w:color w:val="3B3B3B"/>
+          <w:kern w:val="0"/>
+          <w:sz w:val="21"/>
+          <w:szCs w:val="21"/>
+          <w14:ligatures w14:val="none"/>
+        </w:rPr>
+        <w:t>}</w:t>
       </w:r>
     </w:p>
     <w:p>

</xml_diff>